<commit_message>
modif de la doc
</commit_message>
<xml_diff>
--- a/contribution directe (odonyme).docx
+++ b/contribution directe (odonyme).docx
@@ -1,6 +1,6 @@
 
 <file path=word/document.xml><?xml version="1.0" encoding="utf-8"?>
-<w:document xmlns:wpc="http://schemas.microsoft.com/office/word/2010/wordprocessingCanvas" xmlns:cx="http://schemas.microsoft.com/office/drawing/2014/chartex" xmlns:cx1="http://schemas.microsoft.com/office/drawing/2015/9/8/chartex" xmlns:cx2="http://schemas.microsoft.com/office/drawing/2015/10/21/chartex" xmlns:cx3="http://schemas.microsoft.com/office/drawing/2016/5/9/chartex" xmlns:cx4="http://schemas.microsoft.com/office/drawing/2016/5/10/chartex" xmlns:cx5="http://schemas.microsoft.com/office/drawing/2016/5/11/chartex" xmlns:cx6="http://schemas.microsoft.com/office/drawing/2016/5/12/chartex" xmlns:cx7="http://schemas.microsoft.com/office/drawing/2016/5/13/chartex" xmlns:cx8="http://schemas.microsoft.com/office/drawing/2016/5/14/chartex" xmlns:mc="http://schemas.openxmlformats.org/markup-compatibility/2006" xmlns:aink="http://schemas.microsoft.com/office/drawing/2016/ink" xmlns:am3d="http://schemas.microsoft.com/office/drawing/2017/model3d" xmlns:o="urn:schemas-microsoft-com:office:office" xmlns:r="http://schemas.openxmlformats.org/officeDocument/2006/relationships" xmlns:m="http://schemas.openxmlformats.org/officeDocument/2006/math" xmlns:v="urn:schemas-microsoft-com:vml" xmlns:wp14="http://schemas.microsoft.com/office/word/2010/wordprocessingDrawing" xmlns:wp="http://schemas.openxmlformats.org/drawingml/2006/wordprocessingDrawing" xmlns:w10="urn:schemas-microsoft-com:office:word" xmlns:w="http://schemas.openxmlformats.org/wordprocessingml/2006/main" xmlns:w14="http://schemas.microsoft.com/office/word/2010/wordml" xmlns:w15="http://schemas.microsoft.com/office/word/2012/wordml" xmlns:w16cex="http://schemas.microsoft.com/office/word/2018/wordml/cex" xmlns:w16cid="http://schemas.microsoft.com/office/word/2016/wordml/cid" xmlns:w16="http://schemas.microsoft.com/office/word/2018/wordml" xmlns:w16sdtdh="http://schemas.microsoft.com/office/word/2020/wordml/sdtdatahash" xmlns:w16se="http://schemas.microsoft.com/office/word/2015/wordml/symex" xmlns:wpg="http://schemas.microsoft.com/office/word/2010/wordprocessingGroup" xmlns:wpi="http://schemas.microsoft.com/office/word/2010/wordprocessingInk" xmlns:wne="http://schemas.microsoft.com/office/word/2006/wordml" xmlns:wps="http://schemas.microsoft.com/office/word/2010/wordprocessingShape" mc:Ignorable="w14 w15 w16se w16cid w16 w16cex w16sdtdh wp14">
+<w:document xmlns:wpc="http://schemas.microsoft.com/office/word/2010/wordprocessingCanvas" xmlns:cx="http://schemas.microsoft.com/office/drawing/2014/chartex" xmlns:cx1="http://schemas.microsoft.com/office/drawing/2015/9/8/chartex" xmlns:cx2="http://schemas.microsoft.com/office/drawing/2015/10/21/chartex" xmlns:cx3="http://schemas.microsoft.com/office/drawing/2016/5/9/chartex" xmlns:cx4="http://schemas.microsoft.com/office/drawing/2016/5/10/chartex" xmlns:cx5="http://schemas.microsoft.com/office/drawing/2016/5/11/chartex" xmlns:cx6="http://schemas.microsoft.com/office/drawing/2016/5/12/chartex" xmlns:cx7="http://schemas.microsoft.com/office/drawing/2016/5/13/chartex" xmlns:cx8="http://schemas.microsoft.com/office/drawing/2016/5/14/chartex" xmlns:mc="http://schemas.openxmlformats.org/markup-compatibility/2006" xmlns:aink="http://schemas.microsoft.com/office/drawing/2016/ink" xmlns:am3d="http://schemas.microsoft.com/office/drawing/2017/model3d" xmlns:o="urn:schemas-microsoft-com:office:office" xmlns:oel="http://schemas.microsoft.com/office/2019/extlst" xmlns:r="http://schemas.openxmlformats.org/officeDocument/2006/relationships" xmlns:m="http://schemas.openxmlformats.org/officeDocument/2006/math" xmlns:v="urn:schemas-microsoft-com:vml" xmlns:wp14="http://schemas.microsoft.com/office/word/2010/wordprocessingDrawing" xmlns:wp="http://schemas.openxmlformats.org/drawingml/2006/wordprocessingDrawing" xmlns:w10="urn:schemas-microsoft-com:office:word" xmlns:w="http://schemas.openxmlformats.org/wordprocessingml/2006/main" xmlns:w14="http://schemas.microsoft.com/office/word/2010/wordml" xmlns:w15="http://schemas.microsoft.com/office/word/2012/wordml" xmlns:w16cex="http://schemas.microsoft.com/office/word/2018/wordml/cex" xmlns:w16cid="http://schemas.microsoft.com/office/word/2016/wordml/cid" xmlns:w16="http://schemas.microsoft.com/office/word/2018/wordml" xmlns:w16du="http://schemas.microsoft.com/office/word/2023/wordml/word16du" xmlns:w16sdtdh="http://schemas.microsoft.com/office/word/2020/wordml/sdtdatahash" xmlns:w16sdtfl="http://schemas.microsoft.com/office/word/2024/wordml/sdtformatlock" xmlns:w16se="http://schemas.microsoft.com/office/word/2015/wordml/symex" xmlns:wpg="http://schemas.microsoft.com/office/word/2010/wordprocessingGroup" xmlns:wpi="http://schemas.microsoft.com/office/word/2010/wordprocessingInk" xmlns:wne="http://schemas.microsoft.com/office/word/2006/wordml" xmlns:wps="http://schemas.microsoft.com/office/word/2010/wordprocessingShape" mc:Ignorable="w14 w15 w16se w16cid w16 w16cex w16sdtdh w16sdtfl w16du wp14">
   <w:body>
     <w:tbl>
       <w:tblPr>
@@ -167,7 +167,17 @@
                 <w:sz w:val="28"/>
                 <w:szCs w:val="28"/>
               </w:rPr>
-              <w:t>2.0</w:t>
+              <w:t>4</w:t>
+            </w:r>
+            <w:r>
+              <w:rPr>
+                <w:rFonts w:ascii="Times New Roman" w:hAnsi="Times New Roman" w:cs="Times New Roman"/>
+                <w:b/>
+                <w:noProof/>
+                <w:sz w:val="28"/>
+                <w:szCs w:val="28"/>
+              </w:rPr>
+              <w:t>.0</w:t>
             </w:r>
           </w:p>
         </w:tc>
@@ -391,7 +401,6 @@
                 <w:dataBinding w:prefixMappings="xmlns:ns0='http://schemas.microsoft.com/office/2006/metadata/properties' xmlns:ns1='http://www.w3.org/2001/XMLSchema-instance' xmlns:ns2='http://schemas.microsoft.com/office/infopath/2007/PartnerControls' xmlns:ns3='a1322699-2fbb-4cce-8aba-176c4fa97253' xmlns:ns4='http://schemas.microsoft.com/sharepoint/v3' xmlns:ns5='http://schemas.microsoft.com/sharepoint/v3/fields' xmlns:ns6='f0ff482e-aa3b-417e-9d65-5f4cb2656651' " w:xpath="/ns0:properties[1]/documentManagement[1]/ns3:Version_IGN[1]" w:storeItemID="{1159403A-C237-488E-8C5E-DABF9FCE7043}"/>
                 <w:text/>
               </w:sdtPr>
-              <w:sdtEndPr/>
               <w:sdtContent>
                 <w:r>
                   <w:rPr>
@@ -399,7 +408,23 @@
                     <w:b/>
                     <w:szCs w:val="18"/>
                   </w:rPr>
-                  <w:t>1.2.0</w:t>
+                  <w:t>1.</w:t>
+                </w:r>
+                <w:r>
+                  <w:rPr>
+                    <w:rFonts w:cs="Arial"/>
+                    <w:b/>
+                    <w:szCs w:val="18"/>
+                  </w:rPr>
+                  <w:t>4</w:t>
+                </w:r>
+                <w:r>
+                  <w:rPr>
+                    <w:rFonts w:cs="Arial"/>
+                    <w:b/>
+                    <w:szCs w:val="18"/>
+                  </w:rPr>
+                  <w:t>.0</w:t>
                 </w:r>
               </w:sdtContent>
             </w:sdt>
@@ -418,14 +443,13 @@
               <w:docPart w:val="C16F81A3EFFC41CF93FB4F105A9B07C8"/>
             </w:placeholder>
             <w:dataBinding w:prefixMappings="xmlns:ns0='http://schemas.microsoft.com/office/2006/metadata/properties' xmlns:ns1='http://www.w3.org/2001/XMLSchema-instance' xmlns:ns2='http://schemas.microsoft.com/office/infopath/2007/PartnerControls' xmlns:ns3='a1322699-2fbb-4cce-8aba-176c4fa97253' xmlns:ns4='http://schemas.microsoft.com/sharepoint/v3' xmlns:ns5='http://schemas.microsoft.com/sharepoint/v3/fields' xmlns:ns6='f0ff482e-aa3b-417e-9d65-5f4cb2656651' " w:xpath="/ns0:properties[1]/documentManagement[1]/ns5:_DCDateCreated[1]" w:storeItemID="{1159403A-C237-488E-8C5E-DABF9FCE7043}"/>
-            <w:date w:fullDate="2026-01-07T00:00:00Z">
+            <w:date w:fullDate="2026-03-13T00:00:00Z">
               <w:dateFormat w:val="dd/MM/yyyy"/>
               <w:lid w:val="fr-FR"/>
               <w:storeMappedDataAs w:val="dateTime"/>
               <w:calendar w:val="gregorian"/>
             </w:date>
           </w:sdtPr>
-          <w:sdtEndPr/>
           <w:sdtContent>
             <w:tc>
               <w:tcPr>
@@ -448,7 +472,14 @@
                     <w:rFonts w:cs="Arial"/>
                     <w:szCs w:val="18"/>
                   </w:rPr>
-                  <w:t>07/01/2026</w:t>
+                  <w:t>13/03</w:t>
+                </w:r>
+                <w:r>
+                  <w:rPr>
+                    <w:rFonts w:cs="Arial"/>
+                    <w:szCs w:val="18"/>
+                  </w:rPr>
+                  <w:t>/2026</w:t>
                 </w:r>
               </w:p>
             </w:tc>
@@ -950,15 +981,15 @@
         <w:tblLook w:val="04A0" w:firstRow="1" w:lastRow="0" w:firstColumn="1" w:lastColumn="0" w:noHBand="0" w:noVBand="1"/>
       </w:tblPr>
       <w:tblGrid>
-        <w:gridCol w:w="1122"/>
-        <w:gridCol w:w="1405"/>
-        <w:gridCol w:w="2499"/>
-        <w:gridCol w:w="4846"/>
+        <w:gridCol w:w="1022"/>
+        <w:gridCol w:w="1607"/>
+        <w:gridCol w:w="2472"/>
+        <w:gridCol w:w="4771"/>
       </w:tblGrid>
       <w:tr>
         <w:tc>
           <w:tcPr>
-            <w:tcW w:w="1135" w:type="dxa"/>
+            <w:tcW w:w="1022" w:type="dxa"/>
             <w:shd w:val="clear" w:color="auto" w:fill="D9D9D9" w:themeFill="background1" w:themeFillShade="D9"/>
           </w:tcPr>
           <w:p>
@@ -980,7 +1011,7 @@
         </w:tc>
         <w:tc>
           <w:tcPr>
-            <w:tcW w:w="1417" w:type="dxa"/>
+            <w:tcW w:w="1607" w:type="dxa"/>
             <w:shd w:val="clear" w:color="auto" w:fill="D9D9D9" w:themeFill="background1" w:themeFillShade="D9"/>
           </w:tcPr>
           <w:p>
@@ -1001,7 +1032,7 @@
         </w:tc>
         <w:tc>
           <w:tcPr>
-            <w:tcW w:w="2552" w:type="dxa"/>
+            <w:tcW w:w="2472" w:type="dxa"/>
             <w:shd w:val="clear" w:color="auto" w:fill="D9D9D9" w:themeFill="background1" w:themeFillShade="D9"/>
           </w:tcPr>
           <w:p>
@@ -1022,7 +1053,7 @@
         </w:tc>
         <w:tc>
           <w:tcPr>
-            <w:tcW w:w="4994" w:type="dxa"/>
+            <w:tcW w:w="4771" w:type="dxa"/>
             <w:shd w:val="clear" w:color="auto" w:fill="D9D9D9" w:themeFill="background1" w:themeFillShade="D9"/>
           </w:tcPr>
           <w:p>
@@ -1046,7 +1077,7 @@
       <w:tr>
         <w:tc>
           <w:tcPr>
-            <w:tcW w:w="1135" w:type="dxa"/>
+            <w:tcW w:w="1022" w:type="dxa"/>
           </w:tcPr>
           <w:p>
             <w:pPr>
@@ -1068,7 +1099,7 @@
         </w:tc>
         <w:tc>
           <w:tcPr>
-            <w:tcW w:w="1417" w:type="dxa"/>
+            <w:tcW w:w="1607" w:type="dxa"/>
           </w:tcPr>
           <w:p>
             <w:pPr>
@@ -1081,7 +1112,7 @@
         </w:tc>
         <w:tc>
           <w:tcPr>
-            <w:tcW w:w="2552" w:type="dxa"/>
+            <w:tcW w:w="2472" w:type="dxa"/>
           </w:tcPr>
           <w:p>
             <w:pPr>
@@ -1108,7 +1139,7 @@
         </w:tc>
         <w:tc>
           <w:tcPr>
-            <w:tcW w:w="4994" w:type="dxa"/>
+            <w:tcW w:w="4771" w:type="dxa"/>
           </w:tcPr>
           <w:p>
             <w:pPr>
@@ -1131,7 +1162,7 @@
       <w:tr>
         <w:tc>
           <w:tcPr>
-            <w:tcW w:w="1135" w:type="dxa"/>
+            <w:tcW w:w="1022" w:type="dxa"/>
           </w:tcPr>
           <w:p>
             <w:pPr>
@@ -1160,7 +1191,7 @@
         </w:tc>
         <w:tc>
           <w:tcPr>
-            <w:tcW w:w="1417" w:type="dxa"/>
+            <w:tcW w:w="1607" w:type="dxa"/>
           </w:tcPr>
           <w:p>
             <w:pPr>
@@ -1196,7 +1227,7 @@
         </w:tc>
         <w:tc>
           <w:tcPr>
-            <w:tcW w:w="2552" w:type="dxa"/>
+            <w:tcW w:w="2472" w:type="dxa"/>
           </w:tcPr>
           <w:p>
             <w:pPr>
@@ -1216,7 +1247,7 @@
         </w:tc>
         <w:tc>
           <w:tcPr>
-            <w:tcW w:w="4994" w:type="dxa"/>
+            <w:tcW w:w="4771" w:type="dxa"/>
           </w:tcPr>
           <w:p>
             <w:pPr>
@@ -1253,7 +1284,7 @@
       <w:tr>
         <w:tc>
           <w:tcPr>
-            <w:tcW w:w="1135" w:type="dxa"/>
+            <w:tcW w:w="1022" w:type="dxa"/>
           </w:tcPr>
           <w:p>
             <w:pPr>
@@ -1275,7 +1306,7 @@
         </w:tc>
         <w:tc>
           <w:tcPr>
-            <w:tcW w:w="1417" w:type="dxa"/>
+            <w:tcW w:w="1607" w:type="dxa"/>
           </w:tcPr>
           <w:p>
             <w:pPr>
@@ -1297,7 +1328,7 @@
         </w:tc>
         <w:tc>
           <w:tcPr>
-            <w:tcW w:w="2552" w:type="dxa"/>
+            <w:tcW w:w="2472" w:type="dxa"/>
           </w:tcPr>
           <w:p>
             <w:pPr>
@@ -1317,7 +1348,7 @@
         </w:tc>
         <w:tc>
           <w:tcPr>
-            <w:tcW w:w="4994" w:type="dxa"/>
+            <w:tcW w:w="4771" w:type="dxa"/>
           </w:tcPr>
           <w:p>
             <w:pPr>
@@ -1340,7 +1371,7 @@
       <w:tr>
         <w:tc>
           <w:tcPr>
-            <w:tcW w:w="1135" w:type="dxa"/>
+            <w:tcW w:w="1022" w:type="dxa"/>
           </w:tcPr>
           <w:p>
             <w:pPr>
@@ -1369,7 +1400,7 @@
         </w:tc>
         <w:tc>
           <w:tcPr>
-            <w:tcW w:w="1417" w:type="dxa"/>
+            <w:tcW w:w="1607" w:type="dxa"/>
           </w:tcPr>
           <w:p>
             <w:pPr>
@@ -1391,7 +1422,7 @@
         </w:tc>
         <w:tc>
           <w:tcPr>
-            <w:tcW w:w="2552" w:type="dxa"/>
+            <w:tcW w:w="2472" w:type="dxa"/>
           </w:tcPr>
           <w:p>
             <w:pPr>
@@ -1411,7 +1442,7 @@
         </w:tc>
         <w:tc>
           <w:tcPr>
-            <w:tcW w:w="4994" w:type="dxa"/>
+            <w:tcW w:w="4771" w:type="dxa"/>
           </w:tcPr>
           <w:p>
             <w:pPr>
@@ -1434,11 +1465,12 @@
       <w:tr>
         <w:tc>
           <w:tcPr>
-            <w:tcW w:w="1135" w:type="dxa"/>
+            <w:tcW w:w="1022" w:type="dxa"/>
           </w:tcPr>
           <w:p>
             <w:pPr>
               <w:ind w:firstLine="0"/>
+              <w:jc w:val="center"/>
               <w:rPr>
                 <w:rFonts w:cs="Arial"/>
                 <w:szCs w:val="18"/>
@@ -1449,7 +1481,7 @@
                 <w:rFonts w:cs="Arial"/>
                 <w:szCs w:val="18"/>
               </w:rPr>
-              <w:t xml:space="preserve">     1.2.0</w:t>
+              <w:t>1.2.0</w:t>
             </w:r>
           </w:p>
         </w:tc>
@@ -1463,7 +1495,7 @@
             <w:tag w:val="_DCDateCreated"/>
             <w:id w:val="870881841"/>
             <w:placeholder>
-              <w:docPart w:val="851186605E2C481BA3DFB2F5FC9E595E"/>
+              <w:docPart w:val="6453662593DC407491F459A1672E3E7E"/>
             </w:placeholder>
             <w:dataBinding w:prefixMappings="xmlns:ns0='http://schemas.microsoft.com/office/2006/metadata/properties' xmlns:ns1='http://www.w3.org/2001/XMLSchema-instance' xmlns:ns2='http://schemas.microsoft.com/office/infopath/2007/PartnerControls' xmlns:ns3='a1322699-2fbb-4cce-8aba-176c4fa97253' xmlns:ns4='http://schemas.microsoft.com/sharepoint/v3' xmlns:ns5='http://schemas.microsoft.com/sharepoint/v3/fields' xmlns:ns6='f0ff482e-aa3b-417e-9d65-5f4cb2656651' " w:xpath="/ns0:properties[1]/documentManagement[1]/ns5:_DCDateCreated[1]" w:storeItemID="{1159403A-C237-488E-8C5E-DABF9FCE7043}"/>
             <w:date w:fullDate="2026-01-07T00:00:00Z">
@@ -1476,7 +1508,7 @@
           <w:sdtContent>
             <w:tc>
               <w:tcPr>
-                <w:tcW w:w="1417" w:type="dxa"/>
+                <w:tcW w:w="1607" w:type="dxa"/>
               </w:tcPr>
               <w:p>
                 <w:pPr>
@@ -1500,7 +1532,7 @@
         </w:sdt>
         <w:tc>
           <w:tcPr>
-            <w:tcW w:w="2552" w:type="dxa"/>
+            <w:tcW w:w="2472" w:type="dxa"/>
           </w:tcPr>
           <w:p>
             <w:pPr>
@@ -1520,11 +1552,12 @@
         </w:tc>
         <w:tc>
           <w:tcPr>
-            <w:tcW w:w="4994" w:type="dxa"/>
+            <w:tcW w:w="4771" w:type="dxa"/>
           </w:tcPr>
           <w:p>
             <w:pPr>
               <w:ind w:firstLine="0"/>
+              <w:jc w:val="left"/>
               <w:rPr>
                 <w:rFonts w:cs="Arial"/>
                 <w:szCs w:val="18"/>
@@ -1535,6 +1568,93 @@
                 <w:rFonts w:cs="Arial"/>
                 <w:szCs w:val="18"/>
               </w:rPr>
+              <w:t>Adaptation à le version 1.2.0 du plugin</w:t>
+            </w:r>
+          </w:p>
+        </w:tc>
+      </w:tr>
+      <w:tr>
+        <w:tc>
+          <w:tcPr>
+            <w:tcW w:w="1022" w:type="dxa"/>
+          </w:tcPr>
+          <w:p>
+            <w:pPr>
+              <w:ind w:firstLine="0"/>
+              <w:jc w:val="center"/>
+              <w:rPr>
+                <w:rFonts w:cs="Arial"/>
+                <w:szCs w:val="18"/>
+              </w:rPr>
+            </w:pPr>
+            <w:r>
+              <w:rPr>
+                <w:rFonts w:cs="Arial"/>
+                <w:szCs w:val="18"/>
+              </w:rPr>
+              <w:t>1.4.0</w:t>
+            </w:r>
+          </w:p>
+        </w:tc>
+        <w:tc>
+          <w:tcPr>
+            <w:tcW w:w="1607" w:type="dxa"/>
+          </w:tcPr>
+          <w:p>
+            <w:pPr>
+              <w:ind w:firstLine="0"/>
+              <w:jc w:val="center"/>
+              <w:rPr>
+                <w:rFonts w:cs="Arial"/>
+                <w:szCs w:val="18"/>
+              </w:rPr>
+            </w:pPr>
+            <w:r>
+              <w:rPr>
+                <w:rFonts w:cs="Arial"/>
+                <w:szCs w:val="18"/>
+              </w:rPr>
+              <w:t>11/03/2026</w:t>
+            </w:r>
+          </w:p>
+        </w:tc>
+        <w:tc>
+          <w:tcPr>
+            <w:tcW w:w="2472" w:type="dxa"/>
+          </w:tcPr>
+          <w:p>
+            <w:pPr>
+              <w:rPr>
+                <w:rFonts w:cs="Arial"/>
+                <w:szCs w:val="18"/>
+              </w:rPr>
+            </w:pPr>
+            <w:r>
+              <w:rPr>
+                <w:rFonts w:cs="Arial"/>
+                <w:szCs w:val="18"/>
+              </w:rPr>
+              <w:t>Philippe Gallen</w:t>
+            </w:r>
+          </w:p>
+        </w:tc>
+        <w:tc>
+          <w:tcPr>
+            <w:tcW w:w="4771" w:type="dxa"/>
+          </w:tcPr>
+          <w:p>
+            <w:pPr>
+              <w:ind w:firstLine="0"/>
+              <w:rPr>
+                <w:rFonts w:cs="Arial"/>
+                <w:szCs w:val="18"/>
+              </w:rPr>
+            </w:pPr>
+            <w:r>
+              <w:rPr>
+                <w:rFonts w:cs="Arial"/>
+                <w:szCs w:val="18"/>
+              </w:rPr>
               <w:t>Adaptation à le version 1.</w:t>
             </w:r>
             <w:r>
@@ -1542,7 +1662,7 @@
                 <w:rFonts w:cs="Arial"/>
                 <w:szCs w:val="18"/>
               </w:rPr>
-              <w:t>2</w:t>
+              <w:t>4</w:t>
             </w:r>
             <w:r>
               <w:rPr>
@@ -1607,8 +1727,10 @@
             <w:rPr>
               <w:rFonts w:asciiTheme="minorHAnsi" w:eastAsiaTheme="minorEastAsia" w:hAnsiTheme="minorHAnsi" w:cstheme="minorBidi"/>
               <w:smallCaps w:val="0"/>
-              <w:sz w:val="22"/>
-              <w:szCs w:val="22"/>
+              <w:kern w:val="2"/>
+              <w:sz w:val="24"/>
+              <w:szCs w:val="24"/>
+              <w14:ligatures w14:val="standardContextual"/>
             </w:rPr>
           </w:pPr>
           <w:r>
@@ -1620,7 +1742,7 @@
           <w:r>
             <w:fldChar w:fldCharType="separate"/>
           </w:r>
-          <w:hyperlink w:anchor="_Toc204335106" w:history="1">
+          <w:hyperlink w:anchor="_Toc224139400" w:history="1">
             <w:r>
               <w:rPr>
                 <w:rStyle w:val="Lienhypertexte"/>
@@ -1631,8 +1753,10 @@
               <w:rPr>
                 <w:rFonts w:asciiTheme="minorHAnsi" w:eastAsiaTheme="minorEastAsia" w:hAnsiTheme="minorHAnsi" w:cstheme="minorBidi"/>
                 <w:smallCaps w:val="0"/>
-                <w:sz w:val="22"/>
-                <w:szCs w:val="22"/>
+                <w:kern w:val="2"/>
+                <w:sz w:val="24"/>
+                <w:szCs w:val="24"/>
+                <w14:ligatures w14:val="standardContextual"/>
               </w:rPr>
               <w:tab/>
             </w:r>
@@ -1658,7 +1782,7 @@
               <w:rPr>
                 <w:webHidden/>
               </w:rPr>
-              <w:instrText xml:space="preserve"> PAGEREF _Toc204335106 \h </w:instrText>
+              <w:instrText xml:space="preserve"> PAGEREF _Toc224139400 \h </w:instrText>
             </w:r>
             <w:r>
               <w:rPr>
@@ -1691,11 +1815,13 @@
             <w:rPr>
               <w:rFonts w:asciiTheme="minorHAnsi" w:eastAsiaTheme="minorEastAsia" w:hAnsiTheme="minorHAnsi" w:cstheme="minorBidi"/>
               <w:smallCaps w:val="0"/>
-              <w:sz w:val="22"/>
-              <w:szCs w:val="22"/>
+              <w:kern w:val="2"/>
+              <w:sz w:val="24"/>
+              <w:szCs w:val="24"/>
+              <w14:ligatures w14:val="standardContextual"/>
             </w:rPr>
           </w:pPr>
-          <w:hyperlink w:anchor="_Toc204335107" w:history="1">
+          <w:hyperlink w:anchor="_Toc224139401" w:history="1">
             <w:r>
               <w:rPr>
                 <w:rStyle w:val="Lienhypertexte"/>
@@ -1706,8 +1832,10 @@
               <w:rPr>
                 <w:rFonts w:asciiTheme="minorHAnsi" w:eastAsiaTheme="minorEastAsia" w:hAnsiTheme="minorHAnsi" w:cstheme="minorBidi"/>
                 <w:smallCaps w:val="0"/>
-                <w:sz w:val="22"/>
-                <w:szCs w:val="22"/>
+                <w:kern w:val="2"/>
+                <w:sz w:val="24"/>
+                <w:szCs w:val="24"/>
+                <w14:ligatures w14:val="standardContextual"/>
               </w:rPr>
               <w:tab/>
             </w:r>
@@ -1733,7 +1861,7 @@
               <w:rPr>
                 <w:webHidden/>
               </w:rPr>
-              <w:instrText xml:space="preserve"> PAGEREF _Toc204335107 \h </w:instrText>
+              <w:instrText xml:space="preserve"> PAGEREF _Toc224139401 \h </w:instrText>
             </w:r>
             <w:r>
               <w:rPr>
@@ -1766,11 +1894,13 @@
             <w:rPr>
               <w:rFonts w:asciiTheme="minorHAnsi" w:eastAsiaTheme="minorEastAsia" w:hAnsiTheme="minorHAnsi" w:cstheme="minorBidi"/>
               <w:smallCaps w:val="0"/>
-              <w:sz w:val="22"/>
-              <w:szCs w:val="22"/>
+              <w:kern w:val="2"/>
+              <w:sz w:val="24"/>
+              <w:szCs w:val="24"/>
+              <w14:ligatures w14:val="standardContextual"/>
             </w:rPr>
           </w:pPr>
-          <w:hyperlink w:anchor="_Toc204335108" w:history="1">
+          <w:hyperlink w:anchor="_Toc224139402" w:history="1">
             <w:r>
               <w:rPr>
                 <w:rStyle w:val="Lienhypertexte"/>
@@ -1781,8 +1911,10 @@
               <w:rPr>
                 <w:rFonts w:asciiTheme="minorHAnsi" w:eastAsiaTheme="minorEastAsia" w:hAnsiTheme="minorHAnsi" w:cstheme="minorBidi"/>
                 <w:smallCaps w:val="0"/>
-                <w:sz w:val="22"/>
-                <w:szCs w:val="22"/>
+                <w:kern w:val="2"/>
+                <w:sz w:val="24"/>
+                <w:szCs w:val="24"/>
+                <w14:ligatures w14:val="standardContextual"/>
               </w:rPr>
               <w:tab/>
             </w:r>
@@ -1808,7 +1940,7 @@
               <w:rPr>
                 <w:webHidden/>
               </w:rPr>
-              <w:instrText xml:space="preserve"> PAGEREF _Toc204335108 \h </w:instrText>
+              <w:instrText xml:space="preserve"> PAGEREF _Toc224139402 \h </w:instrText>
             </w:r>
             <w:r>
               <w:rPr>
@@ -1841,11 +1973,13 @@
             <w:rPr>
               <w:rFonts w:asciiTheme="minorHAnsi" w:eastAsiaTheme="minorEastAsia" w:hAnsiTheme="minorHAnsi" w:cstheme="minorBidi"/>
               <w:smallCaps w:val="0"/>
-              <w:sz w:val="22"/>
-              <w:szCs w:val="22"/>
+              <w:kern w:val="2"/>
+              <w:sz w:val="24"/>
+              <w:szCs w:val="24"/>
+              <w14:ligatures w14:val="standardContextual"/>
             </w:rPr>
           </w:pPr>
-          <w:hyperlink w:anchor="_Toc204335109" w:history="1">
+          <w:hyperlink w:anchor="_Toc224139403" w:history="1">
             <w:r>
               <w:rPr>
                 <w:rStyle w:val="Lienhypertexte"/>
@@ -1856,8 +1990,10 @@
               <w:rPr>
                 <w:rFonts w:asciiTheme="minorHAnsi" w:eastAsiaTheme="minorEastAsia" w:hAnsiTheme="minorHAnsi" w:cstheme="minorBidi"/>
                 <w:smallCaps w:val="0"/>
-                <w:sz w:val="22"/>
-                <w:szCs w:val="22"/>
+                <w:kern w:val="2"/>
+                <w:sz w:val="24"/>
+                <w:szCs w:val="24"/>
+                <w14:ligatures w14:val="standardContextual"/>
               </w:rPr>
               <w:tab/>
             </w:r>
@@ -1883,7 +2019,7 @@
               <w:rPr>
                 <w:webHidden/>
               </w:rPr>
-              <w:instrText xml:space="preserve"> PAGEREF _Toc204335109 \h </w:instrText>
+              <w:instrText xml:space="preserve"> PAGEREF _Toc224139403 \h </w:instrText>
             </w:r>
             <w:r>
               <w:rPr>
@@ -1916,11 +2052,13 @@
             <w:rPr>
               <w:rFonts w:asciiTheme="minorHAnsi" w:eastAsiaTheme="minorEastAsia" w:hAnsiTheme="minorHAnsi" w:cstheme="minorBidi"/>
               <w:smallCaps w:val="0"/>
-              <w:sz w:val="22"/>
-              <w:szCs w:val="22"/>
+              <w:kern w:val="2"/>
+              <w:sz w:val="24"/>
+              <w:szCs w:val="24"/>
+              <w14:ligatures w14:val="standardContextual"/>
             </w:rPr>
           </w:pPr>
-          <w:hyperlink w:anchor="_Toc204335110" w:history="1">
+          <w:hyperlink w:anchor="_Toc224139404" w:history="1">
             <w:r>
               <w:rPr>
                 <w:rStyle w:val="Lienhypertexte"/>
@@ -1931,8 +2069,10 @@
               <w:rPr>
                 <w:rFonts w:asciiTheme="minorHAnsi" w:eastAsiaTheme="minorEastAsia" w:hAnsiTheme="minorHAnsi" w:cstheme="minorBidi"/>
                 <w:smallCaps w:val="0"/>
-                <w:sz w:val="22"/>
-                <w:szCs w:val="22"/>
+                <w:kern w:val="2"/>
+                <w:sz w:val="24"/>
+                <w:szCs w:val="24"/>
+                <w14:ligatures w14:val="standardContextual"/>
               </w:rPr>
               <w:tab/>
             </w:r>
@@ -1958,7 +2098,7 @@
               <w:rPr>
                 <w:webHidden/>
               </w:rPr>
-              <w:instrText xml:space="preserve"> PAGEREF _Toc204335110 \h </w:instrText>
+              <w:instrText xml:space="preserve"> PAGEREF _Toc224139404 \h </w:instrText>
             </w:r>
             <w:r>
               <w:rPr>
@@ -1990,11 +2130,13 @@
             <w:pStyle w:val="TM2"/>
             <w:rPr>
               <w:rFonts w:asciiTheme="minorHAnsi" w:eastAsiaTheme="minorEastAsia" w:hAnsiTheme="minorHAnsi" w:cstheme="minorBidi"/>
-              <w:sz w:val="22"/>
-              <w:szCs w:val="22"/>
+              <w:kern w:val="2"/>
+              <w:sz w:val="24"/>
+              <w:szCs w:val="24"/>
+              <w14:ligatures w14:val="standardContextual"/>
             </w:rPr>
           </w:pPr>
-          <w:hyperlink w:anchor="_Toc204335111" w:history="1">
+          <w:hyperlink w:anchor="_Toc224139405" w:history="1">
             <w:r>
               <w:rPr>
                 <w:rStyle w:val="Lienhypertexte"/>
@@ -2004,8 +2146,10 @@
             <w:r>
               <w:rPr>
                 <w:rFonts w:asciiTheme="minorHAnsi" w:eastAsiaTheme="minorEastAsia" w:hAnsiTheme="minorHAnsi" w:cstheme="minorBidi"/>
-                <w:sz w:val="22"/>
-                <w:szCs w:val="22"/>
+                <w:kern w:val="2"/>
+                <w:sz w:val="24"/>
+                <w:szCs w:val="24"/>
+                <w14:ligatures w14:val="standardContextual"/>
               </w:rPr>
               <w:tab/>
             </w:r>
@@ -2031,7 +2175,7 @@
               <w:rPr>
                 <w:webHidden/>
               </w:rPr>
-              <w:instrText xml:space="preserve"> PAGEREF _Toc204335111 \h </w:instrText>
+              <w:instrText xml:space="preserve"> PAGEREF _Toc224139405 \h </w:instrText>
             </w:r>
             <w:r>
               <w:rPr>
@@ -2063,11 +2207,13 @@
             <w:pStyle w:val="TM2"/>
             <w:rPr>
               <w:rFonts w:asciiTheme="minorHAnsi" w:eastAsiaTheme="minorEastAsia" w:hAnsiTheme="minorHAnsi" w:cstheme="minorBidi"/>
-              <w:sz w:val="22"/>
-              <w:szCs w:val="22"/>
+              <w:kern w:val="2"/>
+              <w:sz w:val="24"/>
+              <w:szCs w:val="24"/>
+              <w14:ligatures w14:val="standardContextual"/>
             </w:rPr>
           </w:pPr>
-          <w:hyperlink w:anchor="_Toc204335112" w:history="1">
+          <w:hyperlink w:anchor="_Toc224139406" w:history="1">
             <w:r>
               <w:rPr>
                 <w:rStyle w:val="Lienhypertexte"/>
@@ -2077,8 +2223,10 @@
             <w:r>
               <w:rPr>
                 <w:rFonts w:asciiTheme="minorHAnsi" w:eastAsiaTheme="minorEastAsia" w:hAnsiTheme="minorHAnsi" w:cstheme="minorBidi"/>
-                <w:sz w:val="22"/>
-                <w:szCs w:val="22"/>
+                <w:kern w:val="2"/>
+                <w:sz w:val="24"/>
+                <w:szCs w:val="24"/>
+                <w14:ligatures w14:val="standardContextual"/>
               </w:rPr>
               <w:tab/>
             </w:r>
@@ -2104,7 +2252,7 @@
               <w:rPr>
                 <w:webHidden/>
               </w:rPr>
-              <w:instrText xml:space="preserve"> PAGEREF _Toc204335112 \h </w:instrText>
+              <w:instrText xml:space="preserve"> PAGEREF _Toc224139406 \h </w:instrText>
             </w:r>
             <w:r>
               <w:rPr>
@@ -2136,11 +2284,13 @@
             <w:pStyle w:val="TM2"/>
             <w:rPr>
               <w:rFonts w:asciiTheme="minorHAnsi" w:eastAsiaTheme="minorEastAsia" w:hAnsiTheme="minorHAnsi" w:cstheme="minorBidi"/>
-              <w:sz w:val="22"/>
-              <w:szCs w:val="22"/>
+              <w:kern w:val="2"/>
+              <w:sz w:val="24"/>
+              <w:szCs w:val="24"/>
+              <w14:ligatures w14:val="standardContextual"/>
             </w:rPr>
           </w:pPr>
-          <w:hyperlink w:anchor="_Toc204335113" w:history="1">
+          <w:hyperlink w:anchor="_Toc224139407" w:history="1">
             <w:r>
               <w:rPr>
                 <w:rStyle w:val="Lienhypertexte"/>
@@ -2150,8 +2300,10 @@
             <w:r>
               <w:rPr>
                 <w:rFonts w:asciiTheme="minorHAnsi" w:eastAsiaTheme="minorEastAsia" w:hAnsiTheme="minorHAnsi" w:cstheme="minorBidi"/>
-                <w:sz w:val="22"/>
-                <w:szCs w:val="22"/>
+                <w:kern w:val="2"/>
+                <w:sz w:val="24"/>
+                <w:szCs w:val="24"/>
+                <w14:ligatures w14:val="standardContextual"/>
               </w:rPr>
               <w:tab/>
             </w:r>
@@ -2177,7 +2329,7 @@
               <w:rPr>
                 <w:webHidden/>
               </w:rPr>
-              <w:instrText xml:space="preserve"> PAGEREF _Toc204335113 \h </w:instrText>
+              <w:instrText xml:space="preserve"> PAGEREF _Toc224139407 \h </w:instrText>
             </w:r>
             <w:r>
               <w:rPr>
@@ -2210,11 +2362,13 @@
             <w:rPr>
               <w:rFonts w:asciiTheme="minorHAnsi" w:eastAsiaTheme="minorEastAsia" w:hAnsiTheme="minorHAnsi" w:cstheme="minorBidi"/>
               <w:smallCaps w:val="0"/>
-              <w:sz w:val="22"/>
-              <w:szCs w:val="22"/>
+              <w:kern w:val="2"/>
+              <w:sz w:val="24"/>
+              <w:szCs w:val="24"/>
+              <w14:ligatures w14:val="standardContextual"/>
             </w:rPr>
           </w:pPr>
-          <w:hyperlink w:anchor="_Toc204335114" w:history="1">
+          <w:hyperlink w:anchor="_Toc224139408" w:history="1">
             <w:r>
               <w:rPr>
                 <w:rStyle w:val="Lienhypertexte"/>
@@ -2225,8 +2379,10 @@
               <w:rPr>
                 <w:rFonts w:asciiTheme="minorHAnsi" w:eastAsiaTheme="minorEastAsia" w:hAnsiTheme="minorHAnsi" w:cstheme="minorBidi"/>
                 <w:smallCaps w:val="0"/>
-                <w:sz w:val="22"/>
-                <w:szCs w:val="22"/>
+                <w:kern w:val="2"/>
+                <w:sz w:val="24"/>
+                <w:szCs w:val="24"/>
+                <w14:ligatures w14:val="standardContextual"/>
               </w:rPr>
               <w:tab/>
             </w:r>
@@ -2252,7 +2408,7 @@
               <w:rPr>
                 <w:webHidden/>
               </w:rPr>
-              <w:instrText xml:space="preserve"> PAGEREF _Toc204335114 \h </w:instrText>
+              <w:instrText xml:space="preserve"> PAGEREF _Toc224139408 \h </w:instrText>
             </w:r>
             <w:r>
               <w:rPr>
@@ -2285,11 +2441,13 @@
             <w:rPr>
               <w:rFonts w:asciiTheme="minorHAnsi" w:eastAsiaTheme="minorEastAsia" w:hAnsiTheme="minorHAnsi" w:cstheme="minorBidi"/>
               <w:smallCaps w:val="0"/>
-              <w:sz w:val="22"/>
-              <w:szCs w:val="22"/>
+              <w:kern w:val="2"/>
+              <w:sz w:val="24"/>
+              <w:szCs w:val="24"/>
+              <w14:ligatures w14:val="standardContextual"/>
             </w:rPr>
           </w:pPr>
-          <w:hyperlink w:anchor="_Toc204335115" w:history="1">
+          <w:hyperlink w:anchor="_Toc224139409" w:history="1">
             <w:r>
               <w:rPr>
                 <w:rStyle w:val="Lienhypertexte"/>
@@ -2300,8 +2458,10 @@
               <w:rPr>
                 <w:rFonts w:asciiTheme="minorHAnsi" w:eastAsiaTheme="minorEastAsia" w:hAnsiTheme="minorHAnsi" w:cstheme="minorBidi"/>
                 <w:smallCaps w:val="0"/>
-                <w:sz w:val="22"/>
-                <w:szCs w:val="22"/>
+                <w:kern w:val="2"/>
+                <w:sz w:val="24"/>
+                <w:szCs w:val="24"/>
+                <w14:ligatures w14:val="standardContextual"/>
               </w:rPr>
               <w:tab/>
             </w:r>
@@ -2327,7 +2487,7 @@
               <w:rPr>
                 <w:webHidden/>
               </w:rPr>
-              <w:instrText xml:space="preserve"> PAGEREF _Toc204335115 \h </w:instrText>
+              <w:instrText xml:space="preserve"> PAGEREF _Toc224139409 \h </w:instrText>
             </w:r>
             <w:r>
               <w:rPr>
@@ -2360,11 +2520,13 @@
             <w:rPr>
               <w:rFonts w:asciiTheme="minorHAnsi" w:eastAsiaTheme="minorEastAsia" w:hAnsiTheme="minorHAnsi" w:cstheme="minorBidi"/>
               <w:smallCaps w:val="0"/>
-              <w:sz w:val="22"/>
-              <w:szCs w:val="22"/>
+              <w:kern w:val="2"/>
+              <w:sz w:val="24"/>
+              <w:szCs w:val="24"/>
+              <w14:ligatures w14:val="standardContextual"/>
             </w:rPr>
           </w:pPr>
-          <w:hyperlink w:anchor="_Toc204335116" w:history="1">
+          <w:hyperlink w:anchor="_Toc224139410" w:history="1">
             <w:r>
               <w:rPr>
                 <w:rStyle w:val="Lienhypertexte"/>
@@ -2375,8 +2537,10 @@
               <w:rPr>
                 <w:rFonts w:asciiTheme="minorHAnsi" w:eastAsiaTheme="minorEastAsia" w:hAnsiTheme="minorHAnsi" w:cstheme="minorBidi"/>
                 <w:smallCaps w:val="0"/>
-                <w:sz w:val="22"/>
-                <w:szCs w:val="22"/>
+                <w:kern w:val="2"/>
+                <w:sz w:val="24"/>
+                <w:szCs w:val="24"/>
+                <w14:ligatures w14:val="standardContextual"/>
               </w:rPr>
               <w:tab/>
             </w:r>
@@ -2402,7 +2566,7 @@
               <w:rPr>
                 <w:webHidden/>
               </w:rPr>
-              <w:instrText xml:space="preserve"> PAGEREF _Toc204335116 \h </w:instrText>
+              <w:instrText xml:space="preserve"> PAGEREF _Toc224139410 \h </w:instrText>
             </w:r>
             <w:r>
               <w:rPr>
@@ -2435,11 +2599,13 @@
             <w:rPr>
               <w:rFonts w:asciiTheme="minorHAnsi" w:eastAsiaTheme="minorEastAsia" w:hAnsiTheme="minorHAnsi" w:cstheme="minorBidi"/>
               <w:smallCaps w:val="0"/>
-              <w:sz w:val="22"/>
-              <w:szCs w:val="22"/>
+              <w:kern w:val="2"/>
+              <w:sz w:val="24"/>
+              <w:szCs w:val="24"/>
+              <w14:ligatures w14:val="standardContextual"/>
             </w:rPr>
           </w:pPr>
-          <w:hyperlink w:anchor="_Toc204335117" w:history="1">
+          <w:hyperlink w:anchor="_Toc224139411" w:history="1">
             <w:r>
               <w:rPr>
                 <w:rStyle w:val="Lienhypertexte"/>
@@ -2450,8 +2616,10 @@
               <w:rPr>
                 <w:rFonts w:asciiTheme="minorHAnsi" w:eastAsiaTheme="minorEastAsia" w:hAnsiTheme="minorHAnsi" w:cstheme="minorBidi"/>
                 <w:smallCaps w:val="0"/>
-                <w:sz w:val="22"/>
-                <w:szCs w:val="22"/>
+                <w:kern w:val="2"/>
+                <w:sz w:val="24"/>
+                <w:szCs w:val="24"/>
+                <w14:ligatures w14:val="standardContextual"/>
               </w:rPr>
               <w:tab/>
             </w:r>
@@ -2477,7 +2645,7 @@
               <w:rPr>
                 <w:webHidden/>
               </w:rPr>
-              <w:instrText xml:space="preserve"> PAGEREF _Toc204335117 \h </w:instrText>
+              <w:instrText xml:space="preserve"> PAGEREF _Toc224139411 \h </w:instrText>
             </w:r>
             <w:r>
               <w:rPr>
@@ -2509,11 +2677,13 @@
             <w:pStyle w:val="TM2"/>
             <w:rPr>
               <w:rFonts w:asciiTheme="minorHAnsi" w:eastAsiaTheme="minorEastAsia" w:hAnsiTheme="minorHAnsi" w:cstheme="minorBidi"/>
-              <w:sz w:val="22"/>
-              <w:szCs w:val="22"/>
+              <w:kern w:val="2"/>
+              <w:sz w:val="24"/>
+              <w:szCs w:val="24"/>
+              <w14:ligatures w14:val="standardContextual"/>
             </w:rPr>
           </w:pPr>
-          <w:hyperlink w:anchor="_Toc204335118" w:history="1">
+          <w:hyperlink w:anchor="_Toc224139412" w:history="1">
             <w:r>
               <w:rPr>
                 <w:rStyle w:val="Lienhypertexte"/>
@@ -2523,8 +2693,10 @@
             <w:r>
               <w:rPr>
                 <w:rFonts w:asciiTheme="minorHAnsi" w:eastAsiaTheme="minorEastAsia" w:hAnsiTheme="minorHAnsi" w:cstheme="minorBidi"/>
-                <w:sz w:val="22"/>
-                <w:szCs w:val="22"/>
+                <w:kern w:val="2"/>
+                <w:sz w:val="24"/>
+                <w:szCs w:val="24"/>
+                <w14:ligatures w14:val="standardContextual"/>
               </w:rPr>
               <w:tab/>
             </w:r>
@@ -2550,7 +2722,7 @@
               <w:rPr>
                 <w:webHidden/>
               </w:rPr>
-              <w:instrText xml:space="preserve"> PAGEREF _Toc204335118 \h </w:instrText>
+              <w:instrText xml:space="preserve"> PAGEREF _Toc224139412 \h </w:instrText>
             </w:r>
             <w:r>
               <w:rPr>
@@ -2583,6 +2755,7 @@
               <w:b/>
               <w:bCs/>
             </w:rPr>
+            <w:lastRenderedPageBreak/>
             <w:fldChar w:fldCharType="end"/>
           </w:r>
         </w:p>
@@ -2591,18 +2764,8 @@
     <w:p>
       <w:pPr>
         <w:pStyle w:val="Titre1"/>
-        <w:numPr>
-          <w:ilvl w:val="0"/>
-          <w:numId w:val="0"/>
-        </w:numPr>
-        <w:ind w:left="432" w:hanging="432"/>
-      </w:pPr>
-    </w:p>
-    <w:p>
-      <w:pPr>
-        <w:pStyle w:val="Titre1"/>
-      </w:pPr>
-      <w:bookmarkStart w:id="0" w:name="_Toc204335106"/>
+      </w:pPr>
+      <w:bookmarkStart w:id="0" w:name="_Toc224139400"/>
       <w:r>
         <w:t>Prérequis</w:t>
       </w:r>
@@ -2631,7 +2794,15 @@
         <w:t xml:space="preserve"> « IGN Espace collaboratif » version 4.2.2</w:t>
       </w:r>
       <w:r>
-        <w:t xml:space="preserve"> et IGN_Maitre.</w:t>
+        <w:t xml:space="preserve"> et </w:t>
+      </w:r>
+      <w:proofErr w:type="spellStart"/>
+      <w:r>
+        <w:t>IGN_Maitre</w:t>
+      </w:r>
+      <w:proofErr w:type="spellEnd"/>
+      <w:r>
+        <w:t>.</w:t>
       </w:r>
     </w:p>
     <w:p>
@@ -2651,8 +2822,13 @@
         <w:t xml:space="preserve"> couche</w:t>
       </w:r>
       <w:r>
-        <w:t xml:space="preserve"> éditable Tronçon_de_route</w:t>
-      </w:r>
+        <w:t xml:space="preserve"> éditable </w:t>
+      </w:r>
+      <w:proofErr w:type="spellStart"/>
+      <w:r>
+        <w:t>Tronçon_de_route</w:t>
+      </w:r>
+      <w:proofErr w:type="spellEnd"/>
       <w:r>
         <w:t xml:space="preserve"> de la BDTopo</w:t>
       </w:r>
@@ -2660,10 +2836,39 @@
         <w:t>.</w:t>
       </w:r>
     </w:p>
+    <w:p>
+      <w:r>
+        <w:t xml:space="preserve">Le fonctionnement de certaines fonctionnalités nécessite l’installation des plugins IGN </w:t>
+      </w:r>
+    </w:p>
+    <w:p>
+      <w:r>
+        <w:t>(IGN)chemin-le-plus-court-</w:t>
+      </w:r>
+      <w:proofErr w:type="spellStart"/>
+      <w:r>
+        <w:t>qgis</w:t>
+      </w:r>
+      <w:proofErr w:type="spellEnd"/>
+      <w:r>
+        <w:t>-plugin</w:t>
+      </w:r>
+      <w:r>
+        <w:t xml:space="preserve"> (version minimum 1.1.0)</w:t>
+      </w:r>
+    </w:p>
     <w:p/>
     <w:p>
       <w:r>
-        <w:t>Si le package « openpyxl » n’est pas installé sur le poste le message d’erreur ci-dessous apparait lors d’une transaction.</w:t>
+        <w:t>Si le package « </w:t>
+      </w:r>
+      <w:proofErr w:type="spellStart"/>
+      <w:r>
+        <w:t>openpyxl</w:t>
+      </w:r>
+      <w:proofErr w:type="spellEnd"/>
+      <w:r>
+        <w:t> » n’est pas installé sur le poste le message d’erreur ci-dessous apparait lors d’une transaction.</w:t>
       </w:r>
     </w:p>
     <w:p/>
@@ -2727,12 +2932,11 @@
       </w:pPr>
     </w:p>
     <w:p/>
-    <w:p/>
     <w:p>
       <w:pPr>
         <w:pStyle w:val="Titre1"/>
       </w:pPr>
-      <w:bookmarkStart w:id="1" w:name="_Toc204335107"/>
+      <w:bookmarkStart w:id="1" w:name="_Toc224139401"/>
       <w:r>
         <w:t>Résumé</w:t>
       </w:r>
@@ -2875,7 +3079,7 @@
       <w:pPr>
         <w:pStyle w:val="Titre1"/>
       </w:pPr>
-      <w:bookmarkStart w:id="2" w:name="_Toc204335108"/>
+      <w:bookmarkStart w:id="2" w:name="_Toc224139402"/>
       <w:r>
         <w:t>Installation</w:t>
       </w:r>
@@ -2898,7 +3102,6 @@
         <w:t>ier ZIP puis cliquez sur Installer le plugin.</w:t>
       </w:r>
     </w:p>
-    <w:p/>
     <w:p>
       <w:r>
         <w:rPr>
@@ -2941,13 +3144,13 @@
         </w:drawing>
       </w:r>
     </w:p>
-    <w:p/>
     <w:p>
       <w:pPr>
         <w:pStyle w:val="Titre1"/>
       </w:pPr>
-      <w:bookmarkStart w:id="3" w:name="_Toc204335109"/>
-      <w:r>
+      <w:bookmarkStart w:id="3" w:name="_Toc224139403"/>
+      <w:r>
+        <w:lastRenderedPageBreak/>
         <w:t>Présentation</w:t>
       </w:r>
       <w:bookmarkEnd w:id="3"/>
@@ -2961,13 +3164,14 @@
       <w:r>
         <w:rPr>
           <w:rFonts w:cs="Arial"/>
+          <w:noProof/>
           <w:sz w:val="16"/>
           <w:szCs w:val="16"/>
         </w:rPr>
         <w:drawing>
-          <wp:inline distT="0" distB="0" distL="0" distR="0" wp14:anchorId="67809BF5" wp14:editId="16F38248">
-            <wp:extent cx="4826000" cy="1668778"/>
-            <wp:effectExtent l="0" t="0" r="0" b="8255"/>
+          <wp:inline distT="0" distB="0" distL="0" distR="0" wp14:anchorId="67809BF5" wp14:editId="43BF3C3B">
+            <wp:extent cx="4533900" cy="1567773"/>
+            <wp:effectExtent l="0" t="0" r="0" b="0"/>
             <wp:docPr id="5" name="Image 5"/>
             <wp:cNvGraphicFramePr>
               <a:graphicFrameLocks xmlns:a="http://schemas.openxmlformats.org/drawingml/2006/main" noChangeAspect="1"/>
@@ -2988,7 +3192,7 @@
                   <pic:spPr>
                     <a:xfrm>
                       <a:off x="0" y="0"/>
-                      <a:ext cx="4948598" cy="1711171"/>
+                      <a:ext cx="4658425" cy="1610832"/>
                     </a:xfrm>
                     <a:prstGeom prst="rect">
                       <a:avLst/>
@@ -3121,6 +3325,20 @@
       </w:r>
       <w:r>
         <w:t xml:space="preserve"> tronçons de route.</w:t>
+      </w:r>
+    </w:p>
+    <w:p>
+      <w:r>
+        <w:t>(</w:t>
+      </w:r>
+      <w:r>
+        <w:t>Nécessite l’installation</w:t>
+      </w:r>
+      <w:r>
+        <w:t xml:space="preserve"> du plugin IGN</w:t>
+      </w:r>
+      <w:r>
+        <w:t xml:space="preserve"> Sens de numérisation)</w:t>
       </w:r>
     </w:p>
     <w:p/>
@@ -3186,8 +3404,16 @@
       <w:r>
         <w:t xml:space="preserve"> sélectionnés.</w:t>
       </w:r>
-      <w:r>
-        <w:t xml:space="preserve"> </w:t>
+    </w:p>
+    <w:p>
+      <w:r>
+        <w:t>(</w:t>
+      </w:r>
+      <w:r>
+        <w:t>Nécessite l’installation</w:t>
+      </w:r>
+      <w:r>
+        <w:t xml:space="preserve"> du plugin IGN Chemin le plus court)</w:t>
       </w:r>
     </w:p>
     <w:p/>
@@ -3385,7 +3611,15 @@
         <w:t>valide les modifications faites dans l</w:t>
       </w:r>
       <w:r>
-        <w:t>a couche du projet. Pour répercuter les modifications dans la BDUni il faut sauvegarder avec le plugin Espace Collaboratif IGN.</w:t>
+        <w:t xml:space="preserve">a couche du projet. Pour répercuter les modifications dans la </w:t>
+      </w:r>
+      <w:proofErr w:type="spellStart"/>
+      <w:r>
+        <w:t>BDUni</w:t>
+      </w:r>
+      <w:proofErr w:type="spellEnd"/>
+      <w:r>
+        <w:t xml:space="preserve"> il faut sauvegarder avec le plugin Espace Collaboratif IGN.</w:t>
       </w:r>
     </w:p>
     <w:p>
@@ -3481,8 +3715,13 @@
       <w:r>
         <w:t xml:space="preserve"> </w:t>
       </w:r>
-      <w:r>
-        <w:t xml:space="preserve">le point d’exclamation </w:t>
+      <w:proofErr w:type="gramStart"/>
+      <w:r>
+        <w:t>le</w:t>
+      </w:r>
+      <w:proofErr w:type="gramEnd"/>
+      <w:r>
+        <w:t xml:space="preserve"> point d’exclamation </w:t>
       </w:r>
       <w:r>
         <w:t>signifie que les tronçons sélectionnés n’ont pas tous le même nom collaboratif (dérouler la liste pour contrôler)</w:t>
@@ -3500,7 +3739,15 @@
         <w:jc w:val="left"/>
       </w:pPr>
       <w:r>
-        <w:t xml:space="preserve">Le code insee de la commune </w:t>
+        <w:t xml:space="preserve">Le code </w:t>
+      </w:r>
+      <w:proofErr w:type="spellStart"/>
+      <w:r>
+        <w:t>insee</w:t>
+      </w:r>
+      <w:proofErr w:type="spellEnd"/>
+      <w:r>
+        <w:t xml:space="preserve"> de la commune </w:t>
       </w:r>
       <w:r>
         <w:t>limite les actions aux seuls tronçons de la commune indiquée (chemin le plus court, même nom …)</w:t>
@@ -3588,6 +3835,9 @@
         </mc:AlternateContent>
       </w:r>
       <w:r>
+        <w:rPr>
+          <w:noProof/>
+        </w:rPr>
         <w:drawing>
           <wp:inline distT="0" distB="0" distL="0" distR="0" wp14:anchorId="142FFCA5" wp14:editId="0FFC00C3">
             <wp:extent cx="1552792" cy="219106"/>
@@ -3710,7 +3960,7 @@
                 <v:stroke joinstyle="miter"/>
                 <v:path gradientshapeok="t" o:connecttype="rect"/>
               </v:shapetype>
-              <v:shape id="Zone de texte 2" o:spid="_x0000_s1026" type="#_x0000_t202" style="position:absolute;left:0;text-align:left;margin-left:0;margin-top:14.4pt;width:185.9pt;height:110.6pt;z-index:251665408;visibility:visible;mso-wrap-style:square;mso-width-percent:400;mso-height-percent:200;mso-wrap-distance-left:9pt;mso-wrap-distance-top:3.6pt;mso-wrap-distance-right:9pt;mso-wrap-distance-bottom:3.6pt;mso-position-horizontal:center;mso-position-horizontal-relative:text;mso-position-vertical:absolute;mso-position-vertical-relative:text;mso-width-percent:400;mso-height-percent:200;mso-width-relative:margin;mso-height-relative:margin;v-text-anchor:top" o:gfxdata="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" stroked="f">
+              <v:shape id="Zone de texte 2" o:spid="_x0000_s1026" type="#_x0000_t202" style="position:absolute;left:0;text-align:left;margin-left:0;margin-top:14.4pt;width:185.9pt;height:110.6pt;z-index:251665408;visibility:visible;mso-wrap-style:square;mso-width-percent:400;mso-height-percent:200;mso-wrap-distance-left:9pt;mso-wrap-distance-top:3.6pt;mso-wrap-distance-right:9pt;mso-wrap-distance-bottom:3.6pt;mso-position-horizontal:center;mso-position-horizontal-relative:text;mso-position-vertical:absolute;mso-position-vertical-relative:text;mso-width-percent:400;mso-height-percent:200;mso-width-relative:margin;mso-height-relative:margin;v-text-anchor:top" o:gfxdata="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" stroked="f">
                 <v:textbox style="mso-fit-shape-to-text:t">
                   <w:txbxContent>
                     <w:p>
@@ -3727,6 +3977,9 @@
         </mc:AlternateContent>
       </w:r>
       <w:r>
+        <w:rPr>
+          <w:noProof/>
+        </w:rPr>
         <w:drawing>
           <wp:inline distT="0" distB="0" distL="0" distR="0" wp14:anchorId="564438CE" wp14:editId="5F8F47FA">
             <wp:extent cx="859366" cy="1428155"/>
@@ -3777,8 +4030,8 @@
       <w:bookmarkStart w:id="7" w:name="_Toc223756091"/>
       <w:bookmarkStart w:id="8" w:name="_Toc223425647"/>
       <w:bookmarkStart w:id="9" w:name="_Toc223756092"/>
-      <w:bookmarkStart w:id="10" w:name="_Toc204335110"/>
-      <w:bookmarkStart w:id="11" w:name="_Toc215049623"/>
+      <w:bookmarkStart w:id="10" w:name="_Toc215049623"/>
+      <w:bookmarkStart w:id="11" w:name="_Toc224139404"/>
       <w:bookmarkEnd w:id="4"/>
       <w:bookmarkEnd w:id="5"/>
       <w:bookmarkEnd w:id="6"/>
@@ -3786,12 +4039,13 @@
       <w:bookmarkEnd w:id="8"/>
       <w:bookmarkEnd w:id="9"/>
       <w:r>
+        <w:lastRenderedPageBreak/>
         <w:t>Mode de s</w:t>
       </w:r>
       <w:r>
         <w:t>élection</w:t>
       </w:r>
-      <w:bookmarkEnd w:id="10"/>
+      <w:bookmarkEnd w:id="11"/>
     </w:p>
     <w:p/>
     <w:p>
@@ -3819,7 +4073,7 @@
       <w:pPr>
         <w:pStyle w:val="Titre2"/>
       </w:pPr>
-      <w:bookmarkStart w:id="12" w:name="_Toc204335111"/>
+      <w:bookmarkStart w:id="12" w:name="_Toc224139405"/>
       <w:r>
         <w:t>Sélection unique</w:t>
       </w:r>
@@ -3848,7 +4102,7 @@
       <w:pPr>
         <w:pStyle w:val="Titre2"/>
       </w:pPr>
-      <w:bookmarkStart w:id="13" w:name="_Toc204335112"/>
+      <w:bookmarkStart w:id="13" w:name="_Toc224139406"/>
       <w:r>
         <w:t>Sélection multiple</w:t>
       </w:r>
@@ -3933,7 +4187,15 @@
         <w:t xml:space="preserve">le résultat est une sélection de tous les tronçons portant le même nom collaboratif gauche OU droit et inclus dans la commune </w:t>
       </w:r>
       <w:r>
-        <w:t>dont le code insee est affiché dans l’interface.</w:t>
+        <w:t xml:space="preserve">dont le code </w:t>
+      </w:r>
+      <w:proofErr w:type="spellStart"/>
+      <w:r>
+        <w:t>insee</w:t>
+      </w:r>
+      <w:proofErr w:type="spellEnd"/>
+      <w:r>
+        <w:t xml:space="preserve"> est affiché dans l’interface.</w:t>
       </w:r>
     </w:p>
     <w:p>
@@ -4063,7 +4325,7 @@
       <w:pPr>
         <w:pStyle w:val="Titre2"/>
       </w:pPr>
-      <w:bookmarkStart w:id="14" w:name="_Toc204335113"/>
+      <w:bookmarkStart w:id="14" w:name="_Toc224139407"/>
       <w:r>
         <w:t>Affich</w:t>
       </w:r>
@@ -4274,6 +4536,7 @@
         <w:rPr>
           <w:noProof/>
         </w:rPr>
+        <w:lastRenderedPageBreak/>
         <mc:AlternateContent>
           <mc:Choice Requires="wps">
             <w:drawing>
@@ -4376,7 +4639,15 @@
         <w:jc w:val="left"/>
       </w:pPr>
       <w:r>
-        <w:t xml:space="preserve">Il y a un code insee droit et gauche portés par les attributs </w:t>
+        <w:t xml:space="preserve">Il y a un code </w:t>
+      </w:r>
+      <w:proofErr w:type="spellStart"/>
+      <w:r>
+        <w:t>insee</w:t>
+      </w:r>
+      <w:proofErr w:type="spellEnd"/>
+      <w:r>
+        <w:t xml:space="preserve"> droit et gauche portés par les attributs </w:t>
       </w:r>
       <w:r>
         <w:rPr>
@@ -4438,7 +4709,7 @@
       <w:pPr>
         <w:pStyle w:val="Titre1"/>
       </w:pPr>
-      <w:bookmarkStart w:id="15" w:name="_Toc204335114"/>
+      <w:bookmarkStart w:id="15" w:name="_Toc224139408"/>
       <w:r>
         <w:t>Modifications</w:t>
       </w:r>
@@ -4463,7 +4734,13 @@
         <w:t xml:space="preserve">(ou les) </w:t>
       </w:r>
       <w:r>
-        <w:t>nom collaboratif à modifier apparait en rouge.</w:t>
+        <w:t xml:space="preserve">nom collaboratif à modifier apparait en </w:t>
+      </w:r>
+      <w:r>
+        <w:t>bleu</w:t>
+      </w:r>
+      <w:r>
+        <w:t>.</w:t>
       </w:r>
       <w:r>
         <w:rPr>
@@ -4481,14 +4758,11 @@
     </w:p>
     <w:p>
       <w:r>
-        <w:rPr>
-          <w:noProof/>
-        </w:rPr>
         <w:drawing>
-          <wp:inline distT="0" distB="0" distL="0" distR="0" wp14:anchorId="6E7EA724" wp14:editId="0BCF206F">
-            <wp:extent cx="5137266" cy="602300"/>
-            <wp:effectExtent l="0" t="0" r="6350" b="7620"/>
-            <wp:docPr id="10" name="Image 10"/>
+          <wp:inline distT="0" distB="0" distL="0" distR="0" wp14:anchorId="020028CB" wp14:editId="780FDB04">
+            <wp:extent cx="3676650" cy="578208"/>
+            <wp:effectExtent l="0" t="0" r="0" b="0"/>
+            <wp:docPr id="1010446834" name="Image 1" descr="Une image contenant texte, capture d’écran, Police, ligne&#10;&#10;Le contenu généré par l’IA peut être incorrect."/>
             <wp:cNvGraphicFramePr>
               <a:graphicFrameLocks xmlns:a="http://schemas.openxmlformats.org/drawingml/2006/main" noChangeAspect="1"/>
             </wp:cNvGraphicFramePr>
@@ -4496,7 +4770,7 @@
               <a:graphicData uri="http://schemas.openxmlformats.org/drawingml/2006/picture">
                 <pic:pic xmlns:pic="http://schemas.openxmlformats.org/drawingml/2006/picture">
                   <pic:nvPicPr>
-                    <pic:cNvPr id="1" name=""/>
+                    <pic:cNvPr id="1010446834" name="Image 1" descr="Une image contenant texte, capture d’écran, Police, ligne&#10;&#10;Le contenu généré par l’IA peut être incorrect."/>
                     <pic:cNvPicPr/>
                   </pic:nvPicPr>
                   <pic:blipFill>
@@ -4508,7 +4782,7 @@
                   <pic:spPr>
                     <a:xfrm>
                       <a:off x="0" y="0"/>
-                      <a:ext cx="5176036" cy="606845"/>
+                      <a:ext cx="3753135" cy="590236"/>
                     </a:xfrm>
                     <a:prstGeom prst="rect">
                       <a:avLst/>
@@ -4664,7 +4938,7 @@
           <w:numId w:val="2"/>
         </w:numPr>
       </w:pPr>
-      <w:bookmarkStart w:id="16" w:name="_Toc204335115"/>
+      <w:bookmarkStart w:id="16" w:name="_Toc224139409"/>
       <w:r>
         <w:rPr>
           <w:noProof/>
@@ -4711,8 +4985,21 @@
                         <w:txbxContent>
                           <w:p>
                             <w:r>
-                              <w:t>Attention : seule la base client est modifiée. Pour envoyer les modifications sur le serveur BDUni il faut le faire par l’intermédiaire du plugin espace collaboratif IGN, en cliquant sur l’enregistrement de la couche (disquette):</w:t>
+                              <w:t xml:space="preserve">Attention : seule la base client est modifiée. Pour envoyer les modifications sur le serveur </w:t>
                             </w:r>
+                            <w:proofErr w:type="spellStart"/>
+                            <w:r>
+                              <w:t>BDUni</w:t>
+                            </w:r>
+                            <w:proofErr w:type="spellEnd"/>
+                            <w:r>
+                              <w:t xml:space="preserve"> il faut le faire par l’intermédiaire du plugin espace collaboratif IGN, en cliquant sur l’enregistrement de la couche (disquette</w:t>
+                            </w:r>
+                            <w:proofErr w:type="gramStart"/>
+                            <w:r>
+                              <w:t>):</w:t>
+                            </w:r>
+                            <w:proofErr w:type="gramEnd"/>
                           </w:p>
                           <w:p>
                             <w:pPr>
@@ -4797,13 +5084,26 @@
           </mc:Choice>
           <mc:Fallback>
             <w:pict>
-              <v:roundrect w14:anchorId="7BF25F8A" id="Forme automatique 2" o:spid="_x0000_s1027" style="position:absolute;left:0;text-align:left;margin-left:133.6pt;margin-top:461pt;width:90.55pt;height:358.1pt;rotation:90;z-index:251662336;visibility:visible;mso-wrap-style:square;mso-width-percent:0;mso-height-percent:0;mso-wrap-distance-left:10.8pt;mso-wrap-distance-top:7.2pt;mso-wrap-distance-right:10.8pt;mso-wrap-distance-bottom:7.2pt;mso-position-horizontal:absolute;mso-position-horizontal-relative:margin;mso-position-vertical:absolute;mso-position-vertical-relative:margin;mso-width-percent:0;mso-height-percent:0;mso-width-relative:margin;mso-height-relative:margin;v-text-anchor:middle" arcsize="8541f" o:gfxdata="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" o:allowincell="f" fillcolor="#da4232" stroked="f">
+              <v:roundrect w14:anchorId="7BF25F8A" id="Forme automatique 2" o:spid="_x0000_s1027" style="position:absolute;left:0;text-align:left;margin-left:133.6pt;margin-top:461pt;width:90.55pt;height:358.1pt;rotation:90;z-index:251662336;visibility:visible;mso-wrap-style:square;mso-width-percent:0;mso-height-percent:0;mso-wrap-distance-left:10.8pt;mso-wrap-distance-top:7.2pt;mso-wrap-distance-right:10.8pt;mso-wrap-distance-bottom:7.2pt;mso-position-horizontal:absolute;mso-position-horizontal-relative:margin;mso-position-vertical:absolute;mso-position-vertical-relative:margin;mso-width-percent:0;mso-height-percent:0;mso-width-relative:margin;mso-height-relative:margin;v-text-anchor:middle" arcsize="8541f" o:gfxdata="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" o:allowincell="f" fillcolor="#da4232" stroked="f">
                 <v:textbox>
                   <w:txbxContent>
                     <w:p>
                       <w:r>
-                        <w:t>Attention : seule la base client est modifiée. Pour envoyer les modifications sur le serveur BDUni il faut le faire par l’intermédiaire du plugin espace collaboratif IGN, en cliquant sur l’enregistrement de la couche (disquette):</w:t>
+                        <w:t xml:space="preserve">Attention : seule la base client est modifiée. Pour envoyer les modifications sur le serveur </w:t>
                       </w:r>
+                      <w:proofErr w:type="spellStart"/>
+                      <w:r>
+                        <w:t>BDUni</w:t>
+                      </w:r>
+                      <w:proofErr w:type="spellEnd"/>
+                      <w:r>
+                        <w:t xml:space="preserve"> il faut le faire par l’intermédiaire du plugin espace collaboratif IGN, en cliquant sur l’enregistrement de la couche (disquette</w:t>
+                      </w:r>
+                      <w:proofErr w:type="gramStart"/>
+                      <w:r>
+                        <w:t>):</w:t>
+                      </w:r>
+                      <w:proofErr w:type="gramEnd"/>
                     </w:p>
                     <w:p>
                       <w:pPr>
@@ -5071,7 +5371,8 @@
         <w:ind w:left="576"/>
       </w:pPr>
       <w:r>
-        <w:t>avant</w:t>
+        <w:lastRenderedPageBreak/>
+        <w:t>Avant</w:t>
       </w:r>
       <w:r>
         <w:t xml:space="preserve"> l’utilisation du plugin ou juste après une validation lorsque QGIS demande de vous connecter si ce n’est pas déjà fait. Sinon les modifications seront effectives dans QGIS ET non dans l’espace collaboratif.</w:t>
@@ -5118,6 +5419,15 @@
       <w:r>
         <w:t>Si on essaye de modifier un nom collaboratif droite ou gauche d’un tronçon en dehors de la commune choisie, la modification et la contribution directe ne se feront pas.</w:t>
       </w:r>
+    </w:p>
+    <w:p>
+      <w:pPr>
+        <w:pStyle w:val="Paragraphedeliste"/>
+        <w:numPr>
+          <w:ilvl w:val="0"/>
+          <w:numId w:val="6"/>
+        </w:numPr>
+      </w:pPr>
     </w:p>
     <w:p>
       <w:pPr>
@@ -5186,8 +5496,8 @@
       <w:pPr>
         <w:pStyle w:val="Titre1"/>
       </w:pPr>
-      <w:bookmarkStart w:id="17" w:name="_Toc204335116"/>
-      <w:bookmarkEnd w:id="11"/>
+      <w:bookmarkStart w:id="17" w:name="_Toc224139410"/>
+      <w:bookmarkEnd w:id="10"/>
       <w:r>
         <w:t>A propos de</w:t>
       </w:r>
@@ -5332,8 +5642,9 @@
       <w:pPr>
         <w:pStyle w:val="Titre1"/>
       </w:pPr>
-      <w:bookmarkStart w:id="18" w:name="_Toc204335117"/>
-      <w:r>
+      <w:bookmarkStart w:id="18" w:name="_Toc224139411"/>
+      <w:r>
+        <w:lastRenderedPageBreak/>
         <w:t>Annexes</w:t>
       </w:r>
       <w:bookmarkEnd w:id="18"/>
@@ -5344,11 +5655,16 @@
       <w:pPr>
         <w:pStyle w:val="Titre2"/>
       </w:pPr>
-      <w:bookmarkStart w:id="19" w:name="_Toc204335118"/>
-      <w:r>
-        <w:t>Installation d’openpyxl</w:t>
+      <w:bookmarkStart w:id="19" w:name="_Toc224139412"/>
+      <w:r>
+        <w:t>Installation d’</w:t>
+      </w:r>
+      <w:proofErr w:type="spellStart"/>
+      <w:r>
+        <w:t>openpyxl</w:t>
       </w:r>
       <w:bookmarkEnd w:id="19"/>
+      <w:proofErr w:type="spellEnd"/>
     </w:p>
     <w:p/>
     <w:p>
@@ -5426,8 +5742,29 @@
         <w:t>python-qgis-ltr.bat</w:t>
       </w:r>
       <w:r>
-        <w:t xml:space="preserve"> -m pip install openpyxl</w:t>
-      </w:r>
+        <w:t xml:space="preserve"> -m </w:t>
+      </w:r>
+      <w:proofErr w:type="spellStart"/>
+      <w:r>
+        <w:t>pip</w:t>
+      </w:r>
+      <w:proofErr w:type="spellEnd"/>
+      <w:r>
+        <w:t xml:space="preserve"> </w:t>
+      </w:r>
+      <w:proofErr w:type="spellStart"/>
+      <w:r>
+        <w:t>install</w:t>
+      </w:r>
+      <w:proofErr w:type="spellEnd"/>
+      <w:r>
+        <w:t xml:space="preserve"> </w:t>
+      </w:r>
+      <w:proofErr w:type="spellStart"/>
+      <w:r>
+        <w:t>openpyxl</w:t>
+      </w:r>
+      <w:proofErr w:type="spellEnd"/>
     </w:p>
     <w:p>
       <w:pPr>
@@ -5509,7 +5846,7 @@
 </file>
 
 <file path=word/endnotes.xml><?xml version="1.0" encoding="utf-8"?>
-<w:endnotes xmlns:wpc="http://schemas.microsoft.com/office/word/2010/wordprocessingCanvas" xmlns:cx="http://schemas.microsoft.com/office/drawing/2014/chartex" xmlns:cx1="http://schemas.microsoft.com/office/drawing/2015/9/8/chartex" xmlns:cx2="http://schemas.microsoft.com/office/drawing/2015/10/21/chartex" xmlns:cx3="http://schemas.microsoft.com/office/drawing/2016/5/9/chartex" xmlns:cx4="http://schemas.microsoft.com/office/drawing/2016/5/10/chartex" xmlns:cx5="http://schemas.microsoft.com/office/drawing/2016/5/11/chartex" xmlns:cx6="http://schemas.microsoft.com/office/drawing/2016/5/12/chartex" xmlns:cx7="http://schemas.microsoft.com/office/drawing/2016/5/13/chartex" xmlns:cx8="http://schemas.microsoft.com/office/drawing/2016/5/14/chartex" xmlns:mc="http://schemas.openxmlformats.org/markup-compatibility/2006" xmlns:aink="http://schemas.microsoft.com/office/drawing/2016/ink" xmlns:am3d="http://schemas.microsoft.com/office/drawing/2017/model3d" xmlns:o="urn:schemas-microsoft-com:office:office" xmlns:r="http://schemas.openxmlformats.org/officeDocument/2006/relationships" xmlns:m="http://schemas.openxmlformats.org/officeDocument/2006/math" xmlns:v="urn:schemas-microsoft-com:vml" xmlns:wp14="http://schemas.microsoft.com/office/word/2010/wordprocessingDrawing" xmlns:wp="http://schemas.openxmlformats.org/drawingml/2006/wordprocessingDrawing" xmlns:w10="urn:schemas-microsoft-com:office:word" xmlns:w="http://schemas.openxmlformats.org/wordprocessingml/2006/main" xmlns:w14="http://schemas.microsoft.com/office/word/2010/wordml" xmlns:w15="http://schemas.microsoft.com/office/word/2012/wordml" xmlns:w16cex="http://schemas.microsoft.com/office/word/2018/wordml/cex" xmlns:w16cid="http://schemas.microsoft.com/office/word/2016/wordml/cid" xmlns:w16="http://schemas.microsoft.com/office/word/2018/wordml" xmlns:w16sdtdh="http://schemas.microsoft.com/office/word/2020/wordml/sdtdatahash" xmlns:w16se="http://schemas.microsoft.com/office/word/2015/wordml/symex" xmlns:wpg="http://schemas.microsoft.com/office/word/2010/wordprocessingGroup" xmlns:wpi="http://schemas.microsoft.com/office/word/2010/wordprocessingInk" xmlns:wne="http://schemas.microsoft.com/office/word/2006/wordml" xmlns:wps="http://schemas.microsoft.com/office/word/2010/wordprocessingShape" mc:Ignorable="w14 w15 w16se w16cid w16 w16cex w16sdtdh wp14">
+<w:endnotes xmlns:wpc="http://schemas.microsoft.com/office/word/2010/wordprocessingCanvas" xmlns:cx="http://schemas.microsoft.com/office/drawing/2014/chartex" xmlns:cx1="http://schemas.microsoft.com/office/drawing/2015/9/8/chartex" xmlns:cx2="http://schemas.microsoft.com/office/drawing/2015/10/21/chartex" xmlns:cx3="http://schemas.microsoft.com/office/drawing/2016/5/9/chartex" xmlns:cx4="http://schemas.microsoft.com/office/drawing/2016/5/10/chartex" xmlns:cx5="http://schemas.microsoft.com/office/drawing/2016/5/11/chartex" xmlns:cx6="http://schemas.microsoft.com/office/drawing/2016/5/12/chartex" xmlns:cx7="http://schemas.microsoft.com/office/drawing/2016/5/13/chartex" xmlns:cx8="http://schemas.microsoft.com/office/drawing/2016/5/14/chartex" xmlns:mc="http://schemas.openxmlformats.org/markup-compatibility/2006" xmlns:aink="http://schemas.microsoft.com/office/drawing/2016/ink" xmlns:am3d="http://schemas.microsoft.com/office/drawing/2017/model3d" xmlns:o="urn:schemas-microsoft-com:office:office" xmlns:oel="http://schemas.microsoft.com/office/2019/extlst" xmlns:r="http://schemas.openxmlformats.org/officeDocument/2006/relationships" xmlns:m="http://schemas.openxmlformats.org/officeDocument/2006/math" xmlns:v="urn:schemas-microsoft-com:vml" xmlns:wp14="http://schemas.microsoft.com/office/word/2010/wordprocessingDrawing" xmlns:wp="http://schemas.openxmlformats.org/drawingml/2006/wordprocessingDrawing" xmlns:w10="urn:schemas-microsoft-com:office:word" xmlns:w="http://schemas.openxmlformats.org/wordprocessingml/2006/main" xmlns:w14="http://schemas.microsoft.com/office/word/2010/wordml" xmlns:w15="http://schemas.microsoft.com/office/word/2012/wordml" xmlns:w16cex="http://schemas.microsoft.com/office/word/2018/wordml/cex" xmlns:w16cid="http://schemas.microsoft.com/office/word/2016/wordml/cid" xmlns:w16="http://schemas.microsoft.com/office/word/2018/wordml" xmlns:w16du="http://schemas.microsoft.com/office/word/2023/wordml/word16du" xmlns:w16sdtdh="http://schemas.microsoft.com/office/word/2020/wordml/sdtdatahash" xmlns:w16sdtfl="http://schemas.microsoft.com/office/word/2024/wordml/sdtformatlock" xmlns:w16se="http://schemas.microsoft.com/office/word/2015/wordml/symex" xmlns:wpg="http://schemas.microsoft.com/office/word/2010/wordprocessingGroup" xmlns:wpi="http://schemas.microsoft.com/office/word/2010/wordprocessingInk" xmlns:wne="http://schemas.microsoft.com/office/word/2006/wordml" xmlns:wps="http://schemas.microsoft.com/office/word/2010/wordprocessingShape" mc:Ignorable="w14 w15 w16se w16cid w16 w16cex w16sdtdh w16sdtfl w16du wp14">
   <w:endnote w:type="separator" w:id="-1">
     <w:p>
       <w:r>
@@ -5528,7 +5865,7 @@
 </file>
 
 <file path=word/footer1.xml><?xml version="1.0" encoding="utf-8"?>
-<w:ftr xmlns:wpc="http://schemas.microsoft.com/office/word/2010/wordprocessingCanvas" xmlns:cx="http://schemas.microsoft.com/office/drawing/2014/chartex" xmlns:cx1="http://schemas.microsoft.com/office/drawing/2015/9/8/chartex" xmlns:cx2="http://schemas.microsoft.com/office/drawing/2015/10/21/chartex" xmlns:cx3="http://schemas.microsoft.com/office/drawing/2016/5/9/chartex" xmlns:cx4="http://schemas.microsoft.com/office/drawing/2016/5/10/chartex" xmlns:cx5="http://schemas.microsoft.com/office/drawing/2016/5/11/chartex" xmlns:cx6="http://schemas.microsoft.com/office/drawing/2016/5/12/chartex" xmlns:cx7="http://schemas.microsoft.com/office/drawing/2016/5/13/chartex" xmlns:cx8="http://schemas.microsoft.com/office/drawing/2016/5/14/chartex" xmlns:mc="http://schemas.openxmlformats.org/markup-compatibility/2006" xmlns:aink="http://schemas.microsoft.com/office/drawing/2016/ink" xmlns:am3d="http://schemas.microsoft.com/office/drawing/2017/model3d" xmlns:o="urn:schemas-microsoft-com:office:office" xmlns:r="http://schemas.openxmlformats.org/officeDocument/2006/relationships" xmlns:m="http://schemas.openxmlformats.org/officeDocument/2006/math" xmlns:v="urn:schemas-microsoft-com:vml" xmlns:wp14="http://schemas.microsoft.com/office/word/2010/wordprocessingDrawing" xmlns:wp="http://schemas.openxmlformats.org/drawingml/2006/wordprocessingDrawing" xmlns:w10="urn:schemas-microsoft-com:office:word" xmlns:w="http://schemas.openxmlformats.org/wordprocessingml/2006/main" xmlns:w14="http://schemas.microsoft.com/office/word/2010/wordml" xmlns:w15="http://schemas.microsoft.com/office/word/2012/wordml" xmlns:w16cex="http://schemas.microsoft.com/office/word/2018/wordml/cex" xmlns:w16cid="http://schemas.microsoft.com/office/word/2016/wordml/cid" xmlns:w16="http://schemas.microsoft.com/office/word/2018/wordml" xmlns:w16sdtdh="http://schemas.microsoft.com/office/word/2020/wordml/sdtdatahash" xmlns:w16se="http://schemas.microsoft.com/office/word/2015/wordml/symex" xmlns:wpg="http://schemas.microsoft.com/office/word/2010/wordprocessingGroup" xmlns:wpi="http://schemas.microsoft.com/office/word/2010/wordprocessingInk" xmlns:wne="http://schemas.microsoft.com/office/word/2006/wordml" xmlns:wps="http://schemas.microsoft.com/office/word/2010/wordprocessingShape" mc:Ignorable="w14 w15 w16se w16cid w16 w16cex w16sdtdh wp14">
+<w:ftr xmlns:wpc="http://schemas.microsoft.com/office/word/2010/wordprocessingCanvas" xmlns:cx="http://schemas.microsoft.com/office/drawing/2014/chartex" xmlns:cx1="http://schemas.microsoft.com/office/drawing/2015/9/8/chartex" xmlns:cx2="http://schemas.microsoft.com/office/drawing/2015/10/21/chartex" xmlns:cx3="http://schemas.microsoft.com/office/drawing/2016/5/9/chartex" xmlns:cx4="http://schemas.microsoft.com/office/drawing/2016/5/10/chartex" xmlns:cx5="http://schemas.microsoft.com/office/drawing/2016/5/11/chartex" xmlns:cx6="http://schemas.microsoft.com/office/drawing/2016/5/12/chartex" xmlns:cx7="http://schemas.microsoft.com/office/drawing/2016/5/13/chartex" xmlns:cx8="http://schemas.microsoft.com/office/drawing/2016/5/14/chartex" xmlns:mc="http://schemas.openxmlformats.org/markup-compatibility/2006" xmlns:aink="http://schemas.microsoft.com/office/drawing/2016/ink" xmlns:am3d="http://schemas.microsoft.com/office/drawing/2017/model3d" xmlns:o="urn:schemas-microsoft-com:office:office" xmlns:oel="http://schemas.microsoft.com/office/2019/extlst" xmlns:r="http://schemas.openxmlformats.org/officeDocument/2006/relationships" xmlns:m="http://schemas.openxmlformats.org/officeDocument/2006/math" xmlns:v="urn:schemas-microsoft-com:vml" xmlns:wp14="http://schemas.microsoft.com/office/word/2010/wordprocessingDrawing" xmlns:wp="http://schemas.openxmlformats.org/drawingml/2006/wordprocessingDrawing" xmlns:w10="urn:schemas-microsoft-com:office:word" xmlns:w="http://schemas.openxmlformats.org/wordprocessingml/2006/main" xmlns:w14="http://schemas.microsoft.com/office/word/2010/wordml" xmlns:w15="http://schemas.microsoft.com/office/word/2012/wordml" xmlns:w16cex="http://schemas.microsoft.com/office/word/2018/wordml/cex" xmlns:w16cid="http://schemas.microsoft.com/office/word/2016/wordml/cid" xmlns:w16="http://schemas.microsoft.com/office/word/2018/wordml" xmlns:w16du="http://schemas.microsoft.com/office/word/2023/wordml/word16du" xmlns:w16sdtdh="http://schemas.microsoft.com/office/word/2020/wordml/sdtdatahash" xmlns:w16sdtfl="http://schemas.microsoft.com/office/word/2024/wordml/sdtformatlock" xmlns:w16se="http://schemas.microsoft.com/office/word/2015/wordml/symex" xmlns:wpg="http://schemas.microsoft.com/office/word/2010/wordprocessingGroup" xmlns:wpi="http://schemas.microsoft.com/office/word/2010/wordprocessingInk" xmlns:wne="http://schemas.microsoft.com/office/word/2006/wordml" xmlns:wps="http://schemas.microsoft.com/office/word/2010/wordprocessingShape" mc:Ignorable="w14 w15 w16se w16cid w16 w16cex w16sdtdh w16sdtfl w16du wp14">
   <w:tbl>
     <w:tblPr>
       <w:tblW w:w="10228" w:type="dxa"/>
@@ -5732,14 +6069,13 @@
             <w:tag w:val="_DCDateCreated"/>
             <w:id w:val="317545533"/>
             <w:dataBinding w:prefixMappings="xmlns:ns0='http://schemas.microsoft.com/office/2006/metadata/properties' xmlns:ns1='http://www.w3.org/2001/XMLSchema-instance' xmlns:ns2='http://schemas.microsoft.com/office/infopath/2007/PartnerControls' xmlns:ns3='a1322699-2fbb-4cce-8aba-176c4fa97253' xmlns:ns4='http://schemas.microsoft.com/sharepoint/v3' xmlns:ns5='http://schemas.microsoft.com/sharepoint/v3/fields' xmlns:ns6='f0ff482e-aa3b-417e-9d65-5f4cb2656651' " w:xpath="/ns0:properties[1]/documentManagement[1]/ns5:_DCDateCreated[1]" w:storeItemID="{1159403A-C237-488E-8C5E-DABF9FCE7043}"/>
-            <w:date w:fullDate="2026-01-07T00:00:00Z">
+            <w:date w:fullDate="2026-03-11T00:00:00Z">
               <w:dateFormat w:val="dd/MM/yyyy"/>
               <w:lid w:val="fr-FR"/>
               <w:storeMappedDataAs w:val="dateTime"/>
               <w:calendar w:val="gregorian"/>
             </w:date>
           </w:sdtPr>
-          <w:sdtEndPr/>
           <w:sdtContent>
             <w:p>
               <w:pPr>
@@ -5766,7 +6102,17 @@
                   <w:sz w:val="16"/>
                   <w:szCs w:val="16"/>
                 </w:rPr>
-                <w:t>07/01/2026</w:t>
+                <w:t>11/03</w:t>
+              </w:r>
+              <w:r>
+                <w:rPr>
+                  <w:rFonts w:eastAsia="Calibri"/>
+                  <w:noProof/>
+                  <w:color w:val="002060"/>
+                  <w:sz w:val="16"/>
+                  <w:szCs w:val="16"/>
+                </w:rPr>
+                <w:t>/2026</w:t>
               </w:r>
             </w:p>
           </w:sdtContent>
@@ -5928,7 +6274,7 @@
 </file>
 
 <file path=word/footer2.xml><?xml version="1.0" encoding="utf-8"?>
-<w:ftr xmlns:wpc="http://schemas.microsoft.com/office/word/2010/wordprocessingCanvas" xmlns:cx="http://schemas.microsoft.com/office/drawing/2014/chartex" xmlns:cx1="http://schemas.microsoft.com/office/drawing/2015/9/8/chartex" xmlns:cx2="http://schemas.microsoft.com/office/drawing/2015/10/21/chartex" xmlns:cx3="http://schemas.microsoft.com/office/drawing/2016/5/9/chartex" xmlns:cx4="http://schemas.microsoft.com/office/drawing/2016/5/10/chartex" xmlns:cx5="http://schemas.microsoft.com/office/drawing/2016/5/11/chartex" xmlns:cx6="http://schemas.microsoft.com/office/drawing/2016/5/12/chartex" xmlns:cx7="http://schemas.microsoft.com/office/drawing/2016/5/13/chartex" xmlns:cx8="http://schemas.microsoft.com/office/drawing/2016/5/14/chartex" xmlns:mc="http://schemas.openxmlformats.org/markup-compatibility/2006" xmlns:aink="http://schemas.microsoft.com/office/drawing/2016/ink" xmlns:am3d="http://schemas.microsoft.com/office/drawing/2017/model3d" xmlns:o="urn:schemas-microsoft-com:office:office" xmlns:r="http://schemas.openxmlformats.org/officeDocument/2006/relationships" xmlns:m="http://schemas.openxmlformats.org/officeDocument/2006/math" xmlns:v="urn:schemas-microsoft-com:vml" xmlns:wp14="http://schemas.microsoft.com/office/word/2010/wordprocessingDrawing" xmlns:wp="http://schemas.openxmlformats.org/drawingml/2006/wordprocessingDrawing" xmlns:w10="urn:schemas-microsoft-com:office:word" xmlns:w="http://schemas.openxmlformats.org/wordprocessingml/2006/main" xmlns:w14="http://schemas.microsoft.com/office/word/2010/wordml" xmlns:w15="http://schemas.microsoft.com/office/word/2012/wordml" xmlns:w16cex="http://schemas.microsoft.com/office/word/2018/wordml/cex" xmlns:w16cid="http://schemas.microsoft.com/office/word/2016/wordml/cid" xmlns:w16="http://schemas.microsoft.com/office/word/2018/wordml" xmlns:w16sdtdh="http://schemas.microsoft.com/office/word/2020/wordml/sdtdatahash" xmlns:w16se="http://schemas.microsoft.com/office/word/2015/wordml/symex" xmlns:wpg="http://schemas.microsoft.com/office/word/2010/wordprocessingGroup" xmlns:wpi="http://schemas.microsoft.com/office/word/2010/wordprocessingInk" xmlns:wne="http://schemas.microsoft.com/office/word/2006/wordml" xmlns:wps="http://schemas.microsoft.com/office/word/2010/wordprocessingShape" mc:Ignorable="w14 w15 w16se w16cid w16 w16cex w16sdtdh wp14">
+<w:ftr xmlns:wpc="http://schemas.microsoft.com/office/word/2010/wordprocessingCanvas" xmlns:cx="http://schemas.microsoft.com/office/drawing/2014/chartex" xmlns:cx1="http://schemas.microsoft.com/office/drawing/2015/9/8/chartex" xmlns:cx2="http://schemas.microsoft.com/office/drawing/2015/10/21/chartex" xmlns:cx3="http://schemas.microsoft.com/office/drawing/2016/5/9/chartex" xmlns:cx4="http://schemas.microsoft.com/office/drawing/2016/5/10/chartex" xmlns:cx5="http://schemas.microsoft.com/office/drawing/2016/5/11/chartex" xmlns:cx6="http://schemas.microsoft.com/office/drawing/2016/5/12/chartex" xmlns:cx7="http://schemas.microsoft.com/office/drawing/2016/5/13/chartex" xmlns:cx8="http://schemas.microsoft.com/office/drawing/2016/5/14/chartex" xmlns:mc="http://schemas.openxmlformats.org/markup-compatibility/2006" xmlns:aink="http://schemas.microsoft.com/office/drawing/2016/ink" xmlns:am3d="http://schemas.microsoft.com/office/drawing/2017/model3d" xmlns:o="urn:schemas-microsoft-com:office:office" xmlns:oel="http://schemas.microsoft.com/office/2019/extlst" xmlns:r="http://schemas.openxmlformats.org/officeDocument/2006/relationships" xmlns:m="http://schemas.openxmlformats.org/officeDocument/2006/math" xmlns:v="urn:schemas-microsoft-com:vml" xmlns:wp14="http://schemas.microsoft.com/office/word/2010/wordprocessingDrawing" xmlns:wp="http://schemas.openxmlformats.org/drawingml/2006/wordprocessingDrawing" xmlns:w10="urn:schemas-microsoft-com:office:word" xmlns:w="http://schemas.openxmlformats.org/wordprocessingml/2006/main" xmlns:w14="http://schemas.microsoft.com/office/word/2010/wordml" xmlns:w15="http://schemas.microsoft.com/office/word/2012/wordml" xmlns:w16cex="http://schemas.microsoft.com/office/word/2018/wordml/cex" xmlns:w16cid="http://schemas.microsoft.com/office/word/2016/wordml/cid" xmlns:w16="http://schemas.microsoft.com/office/word/2018/wordml" xmlns:w16du="http://schemas.microsoft.com/office/word/2023/wordml/word16du" xmlns:w16sdtdh="http://schemas.microsoft.com/office/word/2020/wordml/sdtdatahash" xmlns:w16sdtfl="http://schemas.microsoft.com/office/word/2024/wordml/sdtformatlock" xmlns:w16se="http://schemas.microsoft.com/office/word/2015/wordml/symex" xmlns:wpg="http://schemas.microsoft.com/office/word/2010/wordprocessingGroup" xmlns:wpi="http://schemas.microsoft.com/office/word/2010/wordprocessingInk" xmlns:wne="http://schemas.microsoft.com/office/word/2006/wordml" xmlns:wps="http://schemas.microsoft.com/office/word/2010/wordprocessingShape" mc:Ignorable="w14 w15 w16se w16cid w16 w16cex w16sdtdh w16sdtfl w16du wp14">
   <w:p>
     <w:pPr>
       <w:pStyle w:val="Pieddepage"/>
@@ -5976,7 +6322,7 @@
 </file>
 
 <file path=word/footnotes.xml><?xml version="1.0" encoding="utf-8"?>
-<w:footnotes xmlns:wpc="http://schemas.microsoft.com/office/word/2010/wordprocessingCanvas" xmlns:cx="http://schemas.microsoft.com/office/drawing/2014/chartex" xmlns:cx1="http://schemas.microsoft.com/office/drawing/2015/9/8/chartex" xmlns:cx2="http://schemas.microsoft.com/office/drawing/2015/10/21/chartex" xmlns:cx3="http://schemas.microsoft.com/office/drawing/2016/5/9/chartex" xmlns:cx4="http://schemas.microsoft.com/office/drawing/2016/5/10/chartex" xmlns:cx5="http://schemas.microsoft.com/office/drawing/2016/5/11/chartex" xmlns:cx6="http://schemas.microsoft.com/office/drawing/2016/5/12/chartex" xmlns:cx7="http://schemas.microsoft.com/office/drawing/2016/5/13/chartex" xmlns:cx8="http://schemas.microsoft.com/office/drawing/2016/5/14/chartex" xmlns:mc="http://schemas.openxmlformats.org/markup-compatibility/2006" xmlns:aink="http://schemas.microsoft.com/office/drawing/2016/ink" xmlns:am3d="http://schemas.microsoft.com/office/drawing/2017/model3d" xmlns:o="urn:schemas-microsoft-com:office:office" xmlns:r="http://schemas.openxmlformats.org/officeDocument/2006/relationships" xmlns:m="http://schemas.openxmlformats.org/officeDocument/2006/math" xmlns:v="urn:schemas-microsoft-com:vml" xmlns:wp14="http://schemas.microsoft.com/office/word/2010/wordprocessingDrawing" xmlns:wp="http://schemas.openxmlformats.org/drawingml/2006/wordprocessingDrawing" xmlns:w10="urn:schemas-microsoft-com:office:word" xmlns:w="http://schemas.openxmlformats.org/wordprocessingml/2006/main" xmlns:w14="http://schemas.microsoft.com/office/word/2010/wordml" xmlns:w15="http://schemas.microsoft.com/office/word/2012/wordml" xmlns:w16cex="http://schemas.microsoft.com/office/word/2018/wordml/cex" xmlns:w16cid="http://schemas.microsoft.com/office/word/2016/wordml/cid" xmlns:w16="http://schemas.microsoft.com/office/word/2018/wordml" xmlns:w16sdtdh="http://schemas.microsoft.com/office/word/2020/wordml/sdtdatahash" xmlns:w16se="http://schemas.microsoft.com/office/word/2015/wordml/symex" xmlns:wpg="http://schemas.microsoft.com/office/word/2010/wordprocessingGroup" xmlns:wpi="http://schemas.microsoft.com/office/word/2010/wordprocessingInk" xmlns:wne="http://schemas.microsoft.com/office/word/2006/wordml" xmlns:wps="http://schemas.microsoft.com/office/word/2010/wordprocessingShape" mc:Ignorable="w14 w15 w16se w16cid w16 w16cex w16sdtdh wp14">
+<w:footnotes xmlns:wpc="http://schemas.microsoft.com/office/word/2010/wordprocessingCanvas" xmlns:cx="http://schemas.microsoft.com/office/drawing/2014/chartex" xmlns:cx1="http://schemas.microsoft.com/office/drawing/2015/9/8/chartex" xmlns:cx2="http://schemas.microsoft.com/office/drawing/2015/10/21/chartex" xmlns:cx3="http://schemas.microsoft.com/office/drawing/2016/5/9/chartex" xmlns:cx4="http://schemas.microsoft.com/office/drawing/2016/5/10/chartex" xmlns:cx5="http://schemas.microsoft.com/office/drawing/2016/5/11/chartex" xmlns:cx6="http://schemas.microsoft.com/office/drawing/2016/5/12/chartex" xmlns:cx7="http://schemas.microsoft.com/office/drawing/2016/5/13/chartex" xmlns:cx8="http://schemas.microsoft.com/office/drawing/2016/5/14/chartex" xmlns:mc="http://schemas.openxmlformats.org/markup-compatibility/2006" xmlns:aink="http://schemas.microsoft.com/office/drawing/2016/ink" xmlns:am3d="http://schemas.microsoft.com/office/drawing/2017/model3d" xmlns:o="urn:schemas-microsoft-com:office:office" xmlns:oel="http://schemas.microsoft.com/office/2019/extlst" xmlns:r="http://schemas.openxmlformats.org/officeDocument/2006/relationships" xmlns:m="http://schemas.openxmlformats.org/officeDocument/2006/math" xmlns:v="urn:schemas-microsoft-com:vml" xmlns:wp14="http://schemas.microsoft.com/office/word/2010/wordprocessingDrawing" xmlns:wp="http://schemas.openxmlformats.org/drawingml/2006/wordprocessingDrawing" xmlns:w10="urn:schemas-microsoft-com:office:word" xmlns:w="http://schemas.openxmlformats.org/wordprocessingml/2006/main" xmlns:w14="http://schemas.microsoft.com/office/word/2010/wordml" xmlns:w15="http://schemas.microsoft.com/office/word/2012/wordml" xmlns:w16cex="http://schemas.microsoft.com/office/word/2018/wordml/cex" xmlns:w16cid="http://schemas.microsoft.com/office/word/2016/wordml/cid" xmlns:w16="http://schemas.microsoft.com/office/word/2018/wordml" xmlns:w16du="http://schemas.microsoft.com/office/word/2023/wordml/word16du" xmlns:w16sdtdh="http://schemas.microsoft.com/office/word/2020/wordml/sdtdatahash" xmlns:w16sdtfl="http://schemas.microsoft.com/office/word/2024/wordml/sdtformatlock" xmlns:w16se="http://schemas.microsoft.com/office/word/2015/wordml/symex" xmlns:wpg="http://schemas.microsoft.com/office/word/2010/wordprocessingGroup" xmlns:wpi="http://schemas.microsoft.com/office/word/2010/wordprocessingInk" xmlns:wne="http://schemas.microsoft.com/office/word/2006/wordml" xmlns:wps="http://schemas.microsoft.com/office/word/2010/wordprocessingShape" mc:Ignorable="w14 w15 w16se w16cid w16 w16cex w16sdtdh w16sdtfl w16du wp14">
   <w:footnote w:type="separator" w:id="-1">
     <w:p>
       <w:r>
@@ -5995,7 +6341,7 @@
 </file>
 
 <file path=word/numbering.xml><?xml version="1.0" encoding="utf-8"?>
-<w:numbering xmlns:wpc="http://schemas.microsoft.com/office/word/2010/wordprocessingCanvas" xmlns:cx="http://schemas.microsoft.com/office/drawing/2014/chartex" xmlns:cx1="http://schemas.microsoft.com/office/drawing/2015/9/8/chartex" xmlns:cx2="http://schemas.microsoft.com/office/drawing/2015/10/21/chartex" xmlns:cx3="http://schemas.microsoft.com/office/drawing/2016/5/9/chartex" xmlns:cx4="http://schemas.microsoft.com/office/drawing/2016/5/10/chartex" xmlns:cx5="http://schemas.microsoft.com/office/drawing/2016/5/11/chartex" xmlns:cx6="http://schemas.microsoft.com/office/drawing/2016/5/12/chartex" xmlns:cx7="http://schemas.microsoft.com/office/drawing/2016/5/13/chartex" xmlns:cx8="http://schemas.microsoft.com/office/drawing/2016/5/14/chartex" xmlns:mc="http://schemas.openxmlformats.org/markup-compatibility/2006" xmlns:aink="http://schemas.microsoft.com/office/drawing/2016/ink" xmlns:am3d="http://schemas.microsoft.com/office/drawing/2017/model3d" xmlns:o="urn:schemas-microsoft-com:office:office" xmlns:r="http://schemas.openxmlformats.org/officeDocument/2006/relationships" xmlns:m="http://schemas.openxmlformats.org/officeDocument/2006/math" xmlns:v="urn:schemas-microsoft-com:vml" xmlns:wp14="http://schemas.microsoft.com/office/word/2010/wordprocessingDrawing" xmlns:wp="http://schemas.openxmlformats.org/drawingml/2006/wordprocessingDrawing" xmlns:w10="urn:schemas-microsoft-com:office:word" xmlns:w="http://schemas.openxmlformats.org/wordprocessingml/2006/main" xmlns:w14="http://schemas.microsoft.com/office/word/2010/wordml" xmlns:w15="http://schemas.microsoft.com/office/word/2012/wordml" xmlns:w16cex="http://schemas.microsoft.com/office/word/2018/wordml/cex" xmlns:w16cid="http://schemas.microsoft.com/office/word/2016/wordml/cid" xmlns:w16="http://schemas.microsoft.com/office/word/2018/wordml" xmlns:w16sdtdh="http://schemas.microsoft.com/office/word/2020/wordml/sdtdatahash" xmlns:w16se="http://schemas.microsoft.com/office/word/2015/wordml/symex" xmlns:wpg="http://schemas.microsoft.com/office/word/2010/wordprocessingGroup" xmlns:wpi="http://schemas.microsoft.com/office/word/2010/wordprocessingInk" xmlns:wne="http://schemas.microsoft.com/office/word/2006/wordml" xmlns:wps="http://schemas.microsoft.com/office/word/2010/wordprocessingShape" mc:Ignorable="w14 w15 w16se w16cid w16 w16cex w16sdtdh wp14">
+<w:numbering xmlns:wpc="http://schemas.microsoft.com/office/word/2010/wordprocessingCanvas" xmlns:cx="http://schemas.microsoft.com/office/drawing/2014/chartex" xmlns:cx1="http://schemas.microsoft.com/office/drawing/2015/9/8/chartex" xmlns:cx2="http://schemas.microsoft.com/office/drawing/2015/10/21/chartex" xmlns:cx3="http://schemas.microsoft.com/office/drawing/2016/5/9/chartex" xmlns:cx4="http://schemas.microsoft.com/office/drawing/2016/5/10/chartex" xmlns:cx5="http://schemas.microsoft.com/office/drawing/2016/5/11/chartex" xmlns:cx6="http://schemas.microsoft.com/office/drawing/2016/5/12/chartex" xmlns:cx7="http://schemas.microsoft.com/office/drawing/2016/5/13/chartex" xmlns:cx8="http://schemas.microsoft.com/office/drawing/2016/5/14/chartex" xmlns:mc="http://schemas.openxmlformats.org/markup-compatibility/2006" xmlns:aink="http://schemas.microsoft.com/office/drawing/2016/ink" xmlns:am3d="http://schemas.microsoft.com/office/drawing/2017/model3d" xmlns:o="urn:schemas-microsoft-com:office:office" xmlns:oel="http://schemas.microsoft.com/office/2019/extlst" xmlns:r="http://schemas.openxmlformats.org/officeDocument/2006/relationships" xmlns:m="http://schemas.openxmlformats.org/officeDocument/2006/math" xmlns:v="urn:schemas-microsoft-com:vml" xmlns:wp14="http://schemas.microsoft.com/office/word/2010/wordprocessingDrawing" xmlns:wp="http://schemas.openxmlformats.org/drawingml/2006/wordprocessingDrawing" xmlns:w10="urn:schemas-microsoft-com:office:word" xmlns:w="http://schemas.openxmlformats.org/wordprocessingml/2006/main" xmlns:w14="http://schemas.microsoft.com/office/word/2010/wordml" xmlns:w15="http://schemas.microsoft.com/office/word/2012/wordml" xmlns:w16cex="http://schemas.microsoft.com/office/word/2018/wordml/cex" xmlns:w16cid="http://schemas.microsoft.com/office/word/2016/wordml/cid" xmlns:w16="http://schemas.microsoft.com/office/word/2018/wordml" xmlns:w16du="http://schemas.microsoft.com/office/word/2023/wordml/word16du" xmlns:w16sdtdh="http://schemas.microsoft.com/office/word/2020/wordml/sdtdatahash" xmlns:w16sdtfl="http://schemas.microsoft.com/office/word/2024/wordml/sdtformatlock" xmlns:w16se="http://schemas.microsoft.com/office/word/2015/wordml/symex" xmlns:wpg="http://schemas.microsoft.com/office/word/2010/wordprocessingGroup" xmlns:wpi="http://schemas.microsoft.com/office/word/2010/wordprocessingInk" xmlns:wne="http://schemas.microsoft.com/office/word/2006/wordml" xmlns:wps="http://schemas.microsoft.com/office/word/2010/wordprocessingShape" mc:Ignorable="w14 w15 w16se w16cid w16 w16cex w16sdtdh w16sdtfl w16du wp14">
   <w:abstractNum w:abstractNumId="0" w15:restartNumberingAfterBreak="0">
     <w:nsid w:val="038C3640"/>
     <w:multiLevelType w:val="hybridMultilevel"/>
@@ -7038,31 +7384,31 @@
       </w:rPr>
     </w:lvl>
   </w:abstractNum>
-  <w:num w:numId="1">
+  <w:num w:numId="1" w16cid:durableId="385494010">
     <w:abstractNumId w:val="7"/>
   </w:num>
-  <w:num w:numId="2">
+  <w:num w:numId="2" w16cid:durableId="843327167">
     <w:abstractNumId w:val="1"/>
   </w:num>
-  <w:num w:numId="3">
+  <w:num w:numId="3" w16cid:durableId="448471910">
     <w:abstractNumId w:val="2"/>
   </w:num>
-  <w:num w:numId="4">
+  <w:num w:numId="4" w16cid:durableId="1110317324">
     <w:abstractNumId w:val="1"/>
   </w:num>
-  <w:num w:numId="5">
+  <w:num w:numId="5" w16cid:durableId="1439250213">
     <w:abstractNumId w:val="4"/>
   </w:num>
-  <w:num w:numId="6">
+  <w:num w:numId="6" w16cid:durableId="408966062">
     <w:abstractNumId w:val="3"/>
   </w:num>
-  <w:num w:numId="7">
+  <w:num w:numId="7" w16cid:durableId="645166544">
     <w:abstractNumId w:val="6"/>
   </w:num>
-  <w:num w:numId="8">
+  <w:num w:numId="8" w16cid:durableId="725419791">
     <w:abstractNumId w:val="5"/>
   </w:num>
-  <w:num w:numId="9">
+  <w:num w:numId="9" w16cid:durableId="1173180542">
     <w:abstractNumId w:val="0"/>
   </w:num>
   <w:numIdMacAtCleanup w:val="6"/>
@@ -7070,7 +7416,7 @@
 </file>
 
 <file path=word/styles.xml><?xml version="1.0" encoding="utf-8"?>
-<w:styles xmlns:mc="http://schemas.openxmlformats.org/markup-compatibility/2006" xmlns:r="http://schemas.openxmlformats.org/officeDocument/2006/relationships" xmlns:w="http://schemas.openxmlformats.org/wordprocessingml/2006/main" xmlns:w14="http://schemas.microsoft.com/office/word/2010/wordml" xmlns:w15="http://schemas.microsoft.com/office/word/2012/wordml" xmlns:w16cex="http://schemas.microsoft.com/office/word/2018/wordml/cex" xmlns:w16cid="http://schemas.microsoft.com/office/word/2016/wordml/cid" xmlns:w16="http://schemas.microsoft.com/office/word/2018/wordml" xmlns:w16sdtdh="http://schemas.microsoft.com/office/word/2020/wordml/sdtdatahash" xmlns:w16se="http://schemas.microsoft.com/office/word/2015/wordml/symex" mc:Ignorable="w14 w15 w16se w16cid w16 w16cex w16sdtdh">
+<w:styles xmlns:mc="http://schemas.openxmlformats.org/markup-compatibility/2006" xmlns:r="http://schemas.openxmlformats.org/officeDocument/2006/relationships" xmlns:w="http://schemas.openxmlformats.org/wordprocessingml/2006/main" xmlns:w14="http://schemas.microsoft.com/office/word/2010/wordml" xmlns:w15="http://schemas.microsoft.com/office/word/2012/wordml" xmlns:w16cex="http://schemas.microsoft.com/office/word/2018/wordml/cex" xmlns:w16cid="http://schemas.microsoft.com/office/word/2016/wordml/cid" xmlns:w16="http://schemas.microsoft.com/office/word/2018/wordml" xmlns:w16du="http://schemas.microsoft.com/office/word/2023/wordml/word16du" xmlns:w16sdtdh="http://schemas.microsoft.com/office/word/2020/wordml/sdtdatahash" xmlns:w16sdtfl="http://schemas.microsoft.com/office/word/2024/wordml/sdtformatlock" xmlns:w16se="http://schemas.microsoft.com/office/word/2015/wordml/symex" mc:Ignorable="w14 w15 w16se w16cid w16 w16cex w16sdtdh w16sdtfl w16du">
   <w:docDefaults>
     <w:rPrDefault>
       <w:rPr>
@@ -8701,7 +9047,7 @@
 </file>
 
 <file path=word/glossary/document.xml><?xml version="1.0" encoding="utf-8"?>
-<w:glossaryDocument xmlns:wpc="http://schemas.microsoft.com/office/word/2010/wordprocessingCanvas" xmlns:cx="http://schemas.microsoft.com/office/drawing/2014/chartex" xmlns:cx1="http://schemas.microsoft.com/office/drawing/2015/9/8/chartex" xmlns:cx2="http://schemas.microsoft.com/office/drawing/2015/10/21/chartex" xmlns:cx3="http://schemas.microsoft.com/office/drawing/2016/5/9/chartex" xmlns:cx4="http://schemas.microsoft.com/office/drawing/2016/5/10/chartex" xmlns:cx5="http://schemas.microsoft.com/office/drawing/2016/5/11/chartex" xmlns:cx6="http://schemas.microsoft.com/office/drawing/2016/5/12/chartex" xmlns:cx7="http://schemas.microsoft.com/office/drawing/2016/5/13/chartex" xmlns:cx8="http://schemas.microsoft.com/office/drawing/2016/5/14/chartex" xmlns:mc="http://schemas.openxmlformats.org/markup-compatibility/2006" xmlns:aink="http://schemas.microsoft.com/office/drawing/2016/ink" xmlns:am3d="http://schemas.microsoft.com/office/drawing/2017/model3d" xmlns:o="urn:schemas-microsoft-com:office:office" xmlns:r="http://schemas.openxmlformats.org/officeDocument/2006/relationships" xmlns:m="http://schemas.openxmlformats.org/officeDocument/2006/math" xmlns:v="urn:schemas-microsoft-com:vml" xmlns:wp14="http://schemas.microsoft.com/office/word/2010/wordprocessingDrawing" xmlns:wp="http://schemas.openxmlformats.org/drawingml/2006/wordprocessingDrawing" xmlns:w10="urn:schemas-microsoft-com:office:word" xmlns:w="http://schemas.openxmlformats.org/wordprocessingml/2006/main" xmlns:w14="http://schemas.microsoft.com/office/word/2010/wordml" xmlns:w15="http://schemas.microsoft.com/office/word/2012/wordml" xmlns:w16cex="http://schemas.microsoft.com/office/word/2018/wordml/cex" xmlns:w16cid="http://schemas.microsoft.com/office/word/2016/wordml/cid" xmlns:w16="http://schemas.microsoft.com/office/word/2018/wordml" xmlns:w16sdtdh="http://schemas.microsoft.com/office/word/2020/wordml/sdtdatahash" xmlns:w16se="http://schemas.microsoft.com/office/word/2015/wordml/symex" xmlns:wpg="http://schemas.microsoft.com/office/word/2010/wordprocessingGroup" xmlns:wpi="http://schemas.microsoft.com/office/word/2010/wordprocessingInk" xmlns:wne="http://schemas.microsoft.com/office/word/2006/wordml" xmlns:wps="http://schemas.microsoft.com/office/word/2010/wordprocessingShape" mc:Ignorable="w14 w15 w16se w16cid w16 w16cex w16sdtdh wp14">
+<w:glossaryDocument xmlns:wpc="http://schemas.microsoft.com/office/word/2010/wordprocessingCanvas" xmlns:cx="http://schemas.microsoft.com/office/drawing/2014/chartex" xmlns:cx1="http://schemas.microsoft.com/office/drawing/2015/9/8/chartex" xmlns:cx2="http://schemas.microsoft.com/office/drawing/2015/10/21/chartex" xmlns:cx3="http://schemas.microsoft.com/office/drawing/2016/5/9/chartex" xmlns:cx4="http://schemas.microsoft.com/office/drawing/2016/5/10/chartex" xmlns:cx5="http://schemas.microsoft.com/office/drawing/2016/5/11/chartex" xmlns:cx6="http://schemas.microsoft.com/office/drawing/2016/5/12/chartex" xmlns:cx7="http://schemas.microsoft.com/office/drawing/2016/5/13/chartex" xmlns:cx8="http://schemas.microsoft.com/office/drawing/2016/5/14/chartex" xmlns:mc="http://schemas.openxmlformats.org/markup-compatibility/2006" xmlns:aink="http://schemas.microsoft.com/office/drawing/2016/ink" xmlns:am3d="http://schemas.microsoft.com/office/drawing/2017/model3d" xmlns:o="urn:schemas-microsoft-com:office:office" xmlns:oel="http://schemas.microsoft.com/office/2019/extlst" xmlns:r="http://schemas.openxmlformats.org/officeDocument/2006/relationships" xmlns:m="http://schemas.openxmlformats.org/officeDocument/2006/math" xmlns:v="urn:schemas-microsoft-com:vml" xmlns:wp14="http://schemas.microsoft.com/office/word/2010/wordprocessingDrawing" xmlns:wp="http://schemas.openxmlformats.org/drawingml/2006/wordprocessingDrawing" xmlns:w10="urn:schemas-microsoft-com:office:word" xmlns:w="http://schemas.openxmlformats.org/wordprocessingml/2006/main" xmlns:w14="http://schemas.microsoft.com/office/word/2010/wordml" xmlns:w15="http://schemas.microsoft.com/office/word/2012/wordml" xmlns:w16cex="http://schemas.microsoft.com/office/word/2018/wordml/cex" xmlns:w16cid="http://schemas.microsoft.com/office/word/2016/wordml/cid" xmlns:w16="http://schemas.microsoft.com/office/word/2018/wordml" xmlns:w16du="http://schemas.microsoft.com/office/word/2023/wordml/word16du" xmlns:w16sdtdh="http://schemas.microsoft.com/office/word/2020/wordml/sdtdatahash" xmlns:w16sdtfl="http://schemas.microsoft.com/office/word/2024/wordml/sdtformatlock" xmlns:w16se="http://schemas.microsoft.com/office/word/2015/wordml/symex" xmlns:wpg="http://schemas.microsoft.com/office/word/2010/wordprocessingGroup" xmlns:wpi="http://schemas.microsoft.com/office/word/2010/wordprocessingInk" xmlns:wne="http://schemas.microsoft.com/office/word/2006/wordml" xmlns:wps="http://schemas.microsoft.com/office/word/2010/wordprocessingShape" mc:Ignorable="w14 w15 w16se w16cid w16 w16cex w16sdtdh w16sdtfl w16du wp14">
   <w:docParts>
     <w:docPart>
       <w:docPartPr>
@@ -8792,7 +9138,7 @@
     </w:docPart>
     <w:docPart>
       <w:docPartPr>
-        <w:name w:val="851186605E2C481BA3DFB2F5FC9E595E"/>
+        <w:name w:val="6453662593DC407491F459A1672E3E7E"/>
         <w:category>
           <w:name w:val="Général"/>
           <w:gallery w:val="placeholder"/>
@@ -8803,12 +9149,12 @@
         <w:behaviors>
           <w:behavior w:val="content"/>
         </w:behaviors>
-        <w:guid w:val="{9D3D023F-B46E-43AE-8439-2331A83CB051}"/>
+        <w:guid w:val="{A1FF6C55-304E-47B0-BC86-D0F29E0269C0}"/>
       </w:docPartPr>
       <w:docPartBody>
         <w:p>
           <w:pPr>
-            <w:pStyle w:val="851186605E2C481BA3DFB2F5FC9E595E"/>
+            <w:pStyle w:val="6453662593DC407491F459A1672E3E7E"/>
           </w:pPr>
           <w:r>
             <w:rPr>
@@ -8824,7 +9170,7 @@
 </file>
 
 <file path=word/glossary/fontTable.xml><?xml version="1.0" encoding="utf-8"?>
-<w:fonts xmlns:mc="http://schemas.openxmlformats.org/markup-compatibility/2006" xmlns:r="http://schemas.openxmlformats.org/officeDocument/2006/relationships" xmlns:w="http://schemas.openxmlformats.org/wordprocessingml/2006/main" xmlns:w14="http://schemas.microsoft.com/office/word/2010/wordml" xmlns:w15="http://schemas.microsoft.com/office/word/2012/wordml" xmlns:w16cex="http://schemas.microsoft.com/office/word/2018/wordml/cex" xmlns:w16cid="http://schemas.microsoft.com/office/word/2016/wordml/cid" xmlns:w16="http://schemas.microsoft.com/office/word/2018/wordml" xmlns:w16sdtdh="http://schemas.microsoft.com/office/word/2020/wordml/sdtdatahash" xmlns:w16se="http://schemas.microsoft.com/office/word/2015/wordml/symex" mc:Ignorable="w14 w15 w16se w16cid w16 w16cex w16sdtdh">
+<w:fonts xmlns:mc="http://schemas.openxmlformats.org/markup-compatibility/2006" xmlns:r="http://schemas.openxmlformats.org/officeDocument/2006/relationships" xmlns:w="http://schemas.openxmlformats.org/wordprocessingml/2006/main" xmlns:w14="http://schemas.microsoft.com/office/word/2010/wordml" xmlns:w15="http://schemas.microsoft.com/office/word/2012/wordml" xmlns:w16cex="http://schemas.microsoft.com/office/word/2018/wordml/cex" xmlns:w16cid="http://schemas.microsoft.com/office/word/2016/wordml/cid" xmlns:w16="http://schemas.microsoft.com/office/word/2018/wordml" xmlns:w16du="http://schemas.microsoft.com/office/word/2023/wordml/word16du" xmlns:w16sdtdh="http://schemas.microsoft.com/office/word/2020/wordml/sdtdatahash" xmlns:w16sdtfl="http://schemas.microsoft.com/office/word/2024/wordml/sdtformatlock" xmlns:w16se="http://schemas.microsoft.com/office/word/2015/wordml/symex" mc:Ignorable="w14 w15 w16se w16cid w16 w16cex w16sdtdh w16sdtfl w16du">
   <w:font w:name="Arial">
     <w:panose1 w:val="020B0604020202020204"/>
     <w:charset w:val="00"/>
@@ -8888,18 +9234,23 @@
     <w:pitch w:val="variable"/>
     <w:sig w:usb0="00000287" w:usb1="00000800" w:usb2="00000000" w:usb3="00000000" w:csb0="0000009F" w:csb1="00000000"/>
   </w:font>
-  <w:font w:name="Calibri Light">
-    <w:panose1 w:val="020F0302020204030204"/>
+  <w:font w:name="Aptos">
     <w:charset w:val="00"/>
     <w:family w:val="swiss"/>
     <w:pitch w:val="variable"/>
-    <w:sig w:usb0="E4002EFF" w:usb1="C200247B" w:usb2="00000009" w:usb3="00000000" w:csb0="000001FF" w:csb1="00000000"/>
+    <w:sig w:usb0="20000287" w:usb1="00000003" w:usb2="00000000" w:usb3="00000000" w:csb0="0000019F" w:csb1="00000000"/>
+  </w:font>
+  <w:font w:name="Aptos Display">
+    <w:charset w:val="00"/>
+    <w:family w:val="swiss"/>
+    <w:pitch w:val="variable"/>
+    <w:sig w:usb0="20000287" w:usb1="00000003" w:usb2="00000000" w:usb3="00000000" w:csb0="0000019F" w:csb1="00000000"/>
   </w:font>
 </w:fonts>
 </file>
 
 <file path=word/glossary/settings.xml><?xml version="1.0" encoding="utf-8"?>
-<w:settings xmlns:mc="http://schemas.openxmlformats.org/markup-compatibility/2006" xmlns:o="urn:schemas-microsoft-com:office:office" xmlns:r="http://schemas.openxmlformats.org/officeDocument/2006/relationships" xmlns:m="http://schemas.openxmlformats.org/officeDocument/2006/math" xmlns:v="urn:schemas-microsoft-com:vml" xmlns:w10="urn:schemas-microsoft-com:office:word" xmlns:w="http://schemas.openxmlformats.org/wordprocessingml/2006/main" xmlns:w14="http://schemas.microsoft.com/office/word/2010/wordml" xmlns:w15="http://schemas.microsoft.com/office/word/2012/wordml" xmlns:w16cex="http://schemas.microsoft.com/office/word/2018/wordml/cex" xmlns:w16cid="http://schemas.microsoft.com/office/word/2016/wordml/cid" xmlns:w16="http://schemas.microsoft.com/office/word/2018/wordml" xmlns:w16sdtdh="http://schemas.microsoft.com/office/word/2020/wordml/sdtdatahash" xmlns:w16se="http://schemas.microsoft.com/office/word/2015/wordml/symex" xmlns:sl="http://schemas.openxmlformats.org/schemaLibrary/2006/main" mc:Ignorable="w14 w15 w16se w16cid w16 w16cex w16sdtdh">
+<w:settings xmlns:mc="http://schemas.openxmlformats.org/markup-compatibility/2006" xmlns:o="urn:schemas-microsoft-com:office:office" xmlns:r="http://schemas.openxmlformats.org/officeDocument/2006/relationships" xmlns:m="http://schemas.openxmlformats.org/officeDocument/2006/math" xmlns:v="urn:schemas-microsoft-com:vml" xmlns:w10="urn:schemas-microsoft-com:office:word" xmlns:w="http://schemas.openxmlformats.org/wordprocessingml/2006/main" xmlns:w14="http://schemas.microsoft.com/office/word/2010/wordml" xmlns:w15="http://schemas.microsoft.com/office/word/2012/wordml" xmlns:w16cex="http://schemas.microsoft.com/office/word/2018/wordml/cex" xmlns:w16cid="http://schemas.microsoft.com/office/word/2016/wordml/cid" xmlns:w16="http://schemas.microsoft.com/office/word/2018/wordml" xmlns:w16du="http://schemas.microsoft.com/office/word/2023/wordml/word16du" xmlns:w16sdtdh="http://schemas.microsoft.com/office/word/2020/wordml/sdtdatahash" xmlns:w16sdtfl="http://schemas.microsoft.com/office/word/2024/wordml/sdtformatlock" xmlns:w16se="http://schemas.microsoft.com/office/word/2015/wordml/symex" xmlns:sl="http://schemas.openxmlformats.org/schemaLibrary/2006/main" mc:Ignorable="w14 w15 w16se w16cid w16 w16cex w16sdtdh w16sdtfl w16du">
   <w:view w:val="normal"/>
   <w:defaultTabStop w:val="708"/>
   <w:hyphenationZone w:val="425"/>
@@ -8933,6 +9284,7 @@
     <w:rsid w:val="00757D77"/>
     <w:rsid w:val="00770502"/>
     <w:rsid w:val="007D0EA0"/>
+    <w:rsid w:val="007F1779"/>
     <w:rsid w:val="00867085"/>
     <w:rsid w:val="008E3192"/>
     <w:rsid w:val="00A07F9B"/>
@@ -8950,6 +9302,8 @@
     <w:rsid w:val="00DB2D73"/>
     <w:rsid w:val="00E17E2D"/>
     <w:rsid w:val="00E40FFF"/>
+    <w:rsid w:val="00EA1863"/>
+    <w:rsid w:val="00EA446D"/>
     <w:rsid w:val="00EC196B"/>
     <w:rsid w:val="00EC264E"/>
     <w:rsid w:val="00F04089"/>
@@ -8978,7 +9332,7 @@
 </file>
 
 <file path=word/glossary/styles.xml><?xml version="1.0" encoding="utf-8"?>
-<w:styles xmlns:mc="http://schemas.openxmlformats.org/markup-compatibility/2006" xmlns:r="http://schemas.openxmlformats.org/officeDocument/2006/relationships" xmlns:w="http://schemas.openxmlformats.org/wordprocessingml/2006/main" xmlns:w14="http://schemas.microsoft.com/office/word/2010/wordml" xmlns:w15="http://schemas.microsoft.com/office/word/2012/wordml" xmlns:w16cex="http://schemas.microsoft.com/office/word/2018/wordml/cex" xmlns:w16cid="http://schemas.microsoft.com/office/word/2016/wordml/cid" xmlns:w16="http://schemas.microsoft.com/office/word/2018/wordml" xmlns:w16sdtdh="http://schemas.microsoft.com/office/word/2020/wordml/sdtdatahash" xmlns:w16se="http://schemas.microsoft.com/office/word/2015/wordml/symex" mc:Ignorable="w14 w15 w16se w16cid w16 w16cex w16sdtdh">
+<w:styles xmlns:mc="http://schemas.openxmlformats.org/markup-compatibility/2006" xmlns:r="http://schemas.openxmlformats.org/officeDocument/2006/relationships" xmlns:w="http://schemas.openxmlformats.org/wordprocessingml/2006/main" xmlns:w14="http://schemas.microsoft.com/office/word/2010/wordml" xmlns:w15="http://schemas.microsoft.com/office/word/2012/wordml" xmlns:w16cex="http://schemas.microsoft.com/office/word/2018/wordml/cex" xmlns:w16cid="http://schemas.microsoft.com/office/word/2016/wordml/cid" xmlns:w16="http://schemas.microsoft.com/office/word/2018/wordml" xmlns:w16du="http://schemas.microsoft.com/office/word/2023/wordml/word16du" xmlns:w16sdtdh="http://schemas.microsoft.com/office/word/2020/wordml/sdtdatahash" xmlns:w16sdtfl="http://schemas.microsoft.com/office/word/2024/wordml/sdtformatlock" xmlns:w16se="http://schemas.microsoft.com/office/word/2015/wordml/symex" mc:Ignorable="w14 w15 w16se w16cid w16 w16cex w16sdtdh w16sdtfl w16du">
   <w:docDefaults>
     <w:rPrDefault>
       <w:rPr>
@@ -9408,7 +9762,7 @@
     <w:basedOn w:val="Policepardfaut"/>
     <w:uiPriority w:val="99"/>
     <w:semiHidden/>
-    <w:rsid w:val="00303223"/>
+    <w:rsid w:val="00EA446D"/>
     <w:rPr>
       <w:color w:val="808080"/>
     </w:rPr>
@@ -9425,12 +9779,18 @@
     <w:name w:val="040C324AC53043D19398B4EE6A36694E"/>
     <w:rsid w:val="00CA38A7"/>
   </w:style>
-  <w:style w:type="paragraph" w:customStyle="1" w:styleId="7B41E071CD1D46DE9C0E42260A82FE7C">
-    <w:name w:val="7B41E071CD1D46DE9C0E42260A82FE7C"/>
-    <w:rsid w:val="00303223"/>
+  <w:style w:type="paragraph" w:customStyle="1" w:styleId="6453662593DC407491F459A1672E3E7E">
+    <w:name w:val="6453662593DC407491F459A1672E3E7E"/>
+    <w:rsid w:val="00EA446D"/>
     <w:pPr>
-      <w:spacing w:after="160" w:line="259" w:lineRule="auto"/>
+      <w:spacing w:after="160" w:line="278" w:lineRule="auto"/>
     </w:pPr>
+    <w:rPr>
+      <w:kern w:val="2"/>
+      <w:sz w:val="24"/>
+      <w:szCs w:val="24"/>
+      <w14:ligatures w14:val="standardContextual"/>
+    </w:rPr>
   </w:style>
   <w:style w:type="paragraph" w:customStyle="1" w:styleId="851186605E2C481BA3DFB2F5FC9E595E">
     <w:name w:val="851186605E2C481BA3DFB2F5FC9E595E"/>
@@ -9443,7 +9803,7 @@
 </file>
 
 <file path=word/glossary/webSettings.xml><?xml version="1.0" encoding="utf-8"?>
-<w:webSettings xmlns:mc="http://schemas.openxmlformats.org/markup-compatibility/2006" xmlns:r="http://schemas.openxmlformats.org/officeDocument/2006/relationships" xmlns:w="http://schemas.openxmlformats.org/wordprocessingml/2006/main" xmlns:w14="http://schemas.microsoft.com/office/word/2010/wordml" xmlns:w15="http://schemas.microsoft.com/office/word/2012/wordml" xmlns:w16cex="http://schemas.microsoft.com/office/word/2018/wordml/cex" xmlns:w16cid="http://schemas.microsoft.com/office/word/2016/wordml/cid" xmlns:w16="http://schemas.microsoft.com/office/word/2018/wordml" xmlns:w16sdtdh="http://schemas.microsoft.com/office/word/2020/wordml/sdtdatahash" xmlns:w16se="http://schemas.microsoft.com/office/word/2015/wordml/symex" mc:Ignorable="w14 w15 w16se w16cid w16 w16cex w16sdtdh">
+<w:webSettings xmlns:mc="http://schemas.openxmlformats.org/markup-compatibility/2006" xmlns:r="http://schemas.openxmlformats.org/officeDocument/2006/relationships" xmlns:w="http://schemas.openxmlformats.org/wordprocessingml/2006/main" xmlns:w14="http://schemas.microsoft.com/office/word/2010/wordml" xmlns:w15="http://schemas.microsoft.com/office/word/2012/wordml" xmlns:w16cex="http://schemas.microsoft.com/office/word/2018/wordml/cex" xmlns:w16cid="http://schemas.microsoft.com/office/word/2016/wordml/cid" xmlns:w16="http://schemas.microsoft.com/office/word/2018/wordml" xmlns:w16du="http://schemas.microsoft.com/office/word/2023/wordml/word16du" xmlns:w16sdtdh="http://schemas.microsoft.com/office/word/2020/wordml/sdtdatahash" xmlns:w16sdtfl="http://schemas.microsoft.com/office/word/2024/wordml/sdtformatlock" xmlns:w16se="http://schemas.microsoft.com/office/word/2015/wordml/symex" mc:Ignorable="w14 w15 w16se w16cid w16 w16cex w16sdtdh w16sdtfl w16du">
   <w:optimizeForBrowser/>
   <w:allowPNG/>
 </w:webSettings>
@@ -9735,29 +10095,6 @@
 </file>
 
 <file path=customXml/item1.xml><?xml version="1.0" encoding="utf-8"?>
-<b:Sources xmlns:b="http://schemas.openxmlformats.org/officeDocument/2006/bibliography" xmlns="http://schemas.openxmlformats.org/officeDocument/2006/bibliography" SelectedStyle="\APA.XSL" StyleName="APA"/>
-</file>
-
-<file path=customXml/item2.xml><?xml version="1.0" encoding="utf-8"?>
-<p:properties xmlns:p="http://schemas.microsoft.com/office/2006/metadata/properties" xmlns:xsi="http://www.w3.org/2001/XMLSchema-instance" xmlns:pc="http://schemas.microsoft.com/office/infopath/2007/PartnerControls">
-  <documentManagement>
-    <lcf76f155ced4ddcb4097134ff3c332f xmlns="b295003c-aa87-407e-9024-fdee4e88f6fa">
-      <Terms xmlns="http://schemas.microsoft.com/office/infopath/2007/PartnerControls"/>
-    </lcf76f155ced4ddcb4097134ff3c332f>
-  </documentManagement>
-</p:properties>
-</file>
-
-<file path=customXml/item3.xml><?xml version="1.0" encoding="utf-8"?>
-<?mso-contentType ?>
-<FormTemplates xmlns="http://schemas.microsoft.com/sharepoint/v3/contenttype/forms">
-  <Display>DocumentLibraryForm</Display>
-  <Edit>DocumentLibraryForm</Edit>
-  <New>DocumentLibraryForm</New>
-</FormTemplates>
-</file>
-
-<file path=customXml/item4.xml><?xml version="1.0" encoding="utf-8"?>
 <ct:contentTypeSchema xmlns:ct="http://schemas.microsoft.com/office/2006/metadata/contentType" xmlns:ma="http://schemas.microsoft.com/office/2006/metadata/properties/metaAttributes" ct:_="" ma:_="" ma:contentTypeName="Document" ma:contentTypeID="0x010100A3FA4CB5114F4B43B99F0B6DC8751D90" ma:contentTypeVersion="10" ma:contentTypeDescription="Crée un document." ma:contentTypeScope="" ma:versionID="501205be520febb413c56432ff8e6df1">
   <xsd:schema xmlns:xsd="http://www.w3.org/2001/XMLSchema" xmlns:xs="http://www.w3.org/2001/XMLSchema" xmlns:p="http://schemas.microsoft.com/office/2006/metadata/properties" xmlns:ns2="b295003c-aa87-407e-9024-fdee4e88f6fa" targetNamespace="http://schemas.microsoft.com/office/2006/metadata/properties" ma:root="true" ma:fieldsID="0378f5bf275aa5e8e5bb75b38d3da7db" ns2:_="">
     <xsd:import namespace="b295003c-aa87-407e-9024-fdee4e88f6fa"/>
@@ -9935,33 +10272,30 @@
 </ct:contentTypeSchema>
 </file>
 
-<file path=customXml/itemProps1.xml><?xml version="1.0" encoding="utf-8"?>
-<ds:datastoreItem xmlns:ds="http://schemas.openxmlformats.org/officeDocument/2006/customXml" ds:itemID="{0FF0F878-5F0F-460C-9013-40E72731A637}">
-  <ds:schemaRefs>
-    <ds:schemaRef ds:uri="http://schemas.openxmlformats.org/officeDocument/2006/bibliography"/>
-  </ds:schemaRefs>
-</ds:datastoreItem>
+<file path=customXml/item2.xml><?xml version="1.0" encoding="utf-8"?>
+<?mso-contentType ?>
+<FormTemplates xmlns="http://schemas.microsoft.com/sharepoint/v3/contenttype/forms">
+  <Display>DocumentLibraryForm</Display>
+  <Edit>DocumentLibraryForm</Edit>
+  <New>DocumentLibraryForm</New>
+</FormTemplates>
 </file>
 
-<file path=customXml/itemProps2.xml><?xml version="1.0" encoding="utf-8"?>
-<ds:datastoreItem xmlns:ds="http://schemas.openxmlformats.org/officeDocument/2006/customXml" ds:itemID="{1159403A-C237-488E-8C5E-DABF9FCE7043}">
-  <ds:schemaRefs>
-    <ds:schemaRef ds:uri="http://schemas.microsoft.com/office/2006/metadata/properties"/>
-    <ds:schemaRef ds:uri="http://schemas.microsoft.com/office/infopath/2007/PartnerControls"/>
-    <ds:schemaRef ds:uri="b295003c-aa87-407e-9024-fdee4e88f6fa"/>
-  </ds:schemaRefs>
-</ds:datastoreItem>
+<file path=customXml/item3.xml><?xml version="1.0" encoding="utf-8"?>
+<p:properties xmlns:p="http://schemas.microsoft.com/office/2006/metadata/properties" xmlns:xsi="http://www.w3.org/2001/XMLSchema-instance" xmlns:pc="http://schemas.microsoft.com/office/infopath/2007/PartnerControls">
+  <documentManagement>
+    <lcf76f155ced4ddcb4097134ff3c332f xmlns="b295003c-aa87-407e-9024-fdee4e88f6fa">
+      <Terms xmlns="http://schemas.microsoft.com/office/infopath/2007/PartnerControls"/>
+    </lcf76f155ced4ddcb4097134ff3c332f>
+  </documentManagement>
+</p:properties>
 </file>
 
-<file path=customXml/itemProps3.xml><?xml version="1.0" encoding="utf-8"?>
-<ds:datastoreItem xmlns:ds="http://schemas.openxmlformats.org/officeDocument/2006/customXml" ds:itemID="{EEE2973D-7DD7-4773-855D-5CAD81242BDE}">
-  <ds:schemaRefs>
-    <ds:schemaRef ds:uri="http://schemas.microsoft.com/sharepoint/v3/contenttype/forms"/>
-  </ds:schemaRefs>
-</ds:datastoreItem>
+<file path=customXml/item4.xml><?xml version="1.0" encoding="utf-8"?>
+<b:Sources xmlns:b="http://schemas.openxmlformats.org/officeDocument/2006/bibliography" xmlns="http://schemas.openxmlformats.org/officeDocument/2006/bibliography" SelectedStyle="\APA.XSL" StyleName="APA"/>
 </file>
 
-<file path=customXml/itemProps4.xml><?xml version="1.0" encoding="utf-8"?>
+<file path=customXml/itemProps1.xml><?xml version="1.0" encoding="utf-8"?>
 <ds:datastoreItem xmlns:ds="http://schemas.openxmlformats.org/officeDocument/2006/customXml" ds:itemID="{74BB8944-94E5-4D6E-A806-EDC8D9D698A5}">
   <ds:schemaRefs>
     <ds:schemaRef ds:uri="http://schemas.microsoft.com/office/2006/metadata/contentType"/>
@@ -9977,4 +10311,30 @@
     <ds:schemaRef ds:uri="http://schemas.microsoft.com/internal/obd"/>
   </ds:schemaRefs>
 </ds:datastoreItem>
+</file>
+
+<file path=customXml/itemProps2.xml><?xml version="1.0" encoding="utf-8"?>
+<ds:datastoreItem xmlns:ds="http://schemas.openxmlformats.org/officeDocument/2006/customXml" ds:itemID="{EEE2973D-7DD7-4773-855D-5CAD81242BDE}">
+  <ds:schemaRefs>
+    <ds:schemaRef ds:uri="http://schemas.microsoft.com/sharepoint/v3/contenttype/forms"/>
+  </ds:schemaRefs>
+</ds:datastoreItem>
+</file>
+
+<file path=customXml/itemProps3.xml><?xml version="1.0" encoding="utf-8"?>
+<ds:datastoreItem xmlns:ds="http://schemas.openxmlformats.org/officeDocument/2006/customXml" ds:itemID="{1159403A-C237-488E-8C5E-DABF9FCE7043}">
+  <ds:schemaRefs>
+    <ds:schemaRef ds:uri="http://schemas.microsoft.com/office/2006/metadata/properties"/>
+    <ds:schemaRef ds:uri="http://schemas.microsoft.com/office/infopath/2007/PartnerControls"/>
+    <ds:schemaRef ds:uri="b295003c-aa87-407e-9024-fdee4e88f6fa"/>
+  </ds:schemaRefs>
+</ds:datastoreItem>
+</file>
+
+<file path=customXml/itemProps4.xml><?xml version="1.0" encoding="utf-8"?>
+<ds:datastoreItem xmlns:ds="http://schemas.openxmlformats.org/officeDocument/2006/customXml" ds:itemID="{0FF0F878-5F0F-460C-9013-40E72731A637}">
+  <ds:schemaRefs>
+    <ds:schemaRef ds:uri="http://schemas.openxmlformats.org/officeDocument/2006/bibliography"/>
+  </ds:schemaRefs>
+</ds:datastoreItem>
 </file>
</xml_diff>